<commit_message>
[Demo] JWT 하드닝: 토큰 subject 를 email(PII) → uuid(불투명 식별자)로
- UserInfo: uuid 컬럼 + @PrePersist 자동생성(모든 생성 경로 공통).
- UserInfoRepository.findByUuid, UserInfoUserDetails.getUuid()(getUsername=email 유지),
  UserInfoUserDetailsService.loadUserByUuid 추가.
- JwtService: generateToken(uuid), extractUsername→extractSubject, validateToken(token,uuid).
- JwtAuthenticationFilter: subject(uuid)로 사용자 조회·검증.
- UserInfoController: 로그인 토큰 subject = uuid.
- 효과(검증됨): payload 에 email 사라짐, 정상 토큰 200, email/랜덤uuid 위조 401.
- 06_JWT_Security.md/.docx: 4-2 절(payload 최소화) 추가 + 지도/정리표 반영.
</commit_message>
<xml_diff>
--- a/docs/security/06_JWT_Security.docx
+++ b/docs/security/06_JWT_Security.docx
@@ -758,7 +758,7 @@
                 <w:sz w:val="18"/>
                 <w:szCs w:val="18"/>
               </w:rPr>
-              <w:t xml:space="preserve">payload 노출</w:t>
+              <w:t xml:space="preserve">payload 노출(base64)</w:t>
             </w:r>
           </w:p>
         </w:tc>
@@ -775,10 +775,11 @@
           <w:p>
             <w:r>
               <w:rPr>
-                <w:sz w:val="18"/>
-                <w:szCs w:val="18"/>
-              </w:rPr>
-              <w:t xml:space="preserve">민감정보 유출</w:t>
+                <w:color w:val="C00000"/>
+                <w:sz w:val="18"/>
+                <w:szCs w:val="18"/>
+              </w:rPr>
+              <w:t xml:space="preserve">email 등 PII 유출</w:t>
             </w:r>
           </w:p>
         </w:tc>
@@ -798,7 +799,7 @@
                 <w:sz w:val="18"/>
                 <w:szCs w:val="18"/>
               </w:rPr>
-              <w:t xml:space="preserve">payload에 민감정보 금지</w:t>
+              <w:t xml:space="preserve">토큰 subject를 email→uuid(불투명)로, 필터는 uuid로 조회</w:t>
             </w:r>
           </w:p>
         </w:tc>
@@ -815,10 +816,11 @@
           <w:p>
             <w:r>
               <w:rPr>
-                <w:sz w:val="18"/>
-                <w:szCs w:val="18"/>
-              </w:rPr>
-              <w:t xml:space="preserve">개념</w:t>
+                <w:color w:val="2E7D32"/>
+                <w:sz w:val="18"/>
+                <w:szCs w:val="18"/>
+              </w:rPr>
+              <w:t xml:space="preserve">코드 추가</w:t>
             </w:r>
           </w:p>
         </w:tc>
@@ -1485,7 +1487,7 @@
           <w:sz w:val="22"/>
           <w:szCs w:val="22"/>
         </w:rPr>
-        <w:t xml:space="preserve">토큰만 있으면 누구나 클레임을 읽는다. 비밀번호·주민번호·권한근거 등 민감정보를 payload 에 넣지 말 것.</w:t>
+        <w:t xml:space="preserve">토큰만 있으면 누구나 클레임을 읽는다. 민감정보를 payload 에 넣지 말 것. 이 앱도 원래 subject 에 email(PII)이 있었다 → 4-2 에서 불투명 uuid 로 교체했다.</w:t>
       </w:r>
     </w:p>
     <w:p>
@@ -2231,9 +2233,433 @@
           <w:sz w:val="21"/>
           <w:szCs w:val="21"/>
         </w:rPr>
-        <w:t xml:space="preserve">4-2. Secret 관리 원칙</w:t>
-      </w:r>
-    </w:p>
+        <w:t xml:space="preserve">4-2. 토큰 subject 를 uuid 로 (payload 최소화 — PII 제거)</w:t>
+      </w:r>
+    </w:p>
+    <w:p>
+      <w:pPr>
+        <w:spacing w:after="90" w:line="276"/>
+      </w:pPr>
+      <w:r>
+        <w:rPr>
+          <w:sz w:val="22"/>
+          <w:szCs w:val="22"/>
+        </w:rPr>
+        <w:t xml:space="preserve">payload 는 공개(base64)이므로 email 같은 PII 를 넣지 않는다. 로그인에 쓰는 email 대신 의미 없는 불투명 식별자(UserInfo.uuid)를 토큰 subject 로 담고, 필터는 그 uuid 로 사용자를 조회한다.</w:t>
+      </w:r>
+    </w:p>
+    <w:p>
+      <w:pPr>
+        <w:spacing w:after="90" w:line="276"/>
+      </w:pPr>
+      <w:r>
+        <w:rPr>
+          <w:b/>
+          <w:bCs/>
+          <w:sz w:val="22"/>
+          <w:szCs w:val="22"/>
+        </w:rPr>
+        <w:t xml:space="preserve">바뀐 코드 (Before → After)</w:t>
+      </w:r>
+    </w:p>
+    <w:p>
+      <w:pPr>
+        <w:pBdr>
+          <w:top w:val="single" w:color="D9D9D9" w:sz="4" w:space="3"/>
+          <w:left w:val="single" w:color="C0C0C0" w:sz="18" w:space="6"/>
+        </w:pBdr>
+        <w:shd w:fill="F4F4F4" w:color="auto" w:val="clear"/>
+      </w:pPr>
+      <w:r>
+        <w:rPr>
+          <w:rFonts w:ascii="Consolas" w:cs="Consolas" w:eastAsia="Consolas" w:hAnsi="Consolas"/>
+          <w:sz w:val="18"/>
+          <w:szCs w:val="18"/>
+        </w:rPr>
+        <w:t xml:space="preserve">// 발급(UserInfoController) : email → uuid</w:t>
+      </w:r>
+    </w:p>
+    <w:p>
+      <w:pPr>
+        <w:pBdr>
+          <w:left w:val="single" w:color="C0C0C0" w:sz="18" w:space="6"/>
+        </w:pBdr>
+        <w:shd w:fill="F4F4F4" w:color="auto" w:val="clear"/>
+      </w:pPr>
+      <w:r>
+        <w:rPr>
+          <w:rFonts w:ascii="Consolas" w:cs="Consolas" w:eastAsia="Consolas" w:hAnsi="Consolas"/>
+          <w:sz w:val="18"/>
+          <w:szCs w:val="18"/>
+        </w:rPr>
+        <w:t xml:space="preserve">// Before: jwtService.generateToken(userDetails.getUsername());   // subject = email(PII)</w:t>
+      </w:r>
+    </w:p>
+    <w:p>
+      <w:pPr>
+        <w:pBdr>
+          <w:left w:val="single" w:color="C0C0C0" w:sz="18" w:space="6"/>
+        </w:pBdr>
+        <w:shd w:fill="F4F4F4" w:color="auto" w:val="clear"/>
+      </w:pPr>
+      <w:r>
+        <w:rPr>
+          <w:rFonts w:ascii="Consolas" w:cs="Consolas" w:eastAsia="Consolas" w:hAnsi="Consolas"/>
+          <w:sz w:val="18"/>
+          <w:szCs w:val="18"/>
+        </w:rPr>
+        <w:t xml:space="preserve">// After : jwtService.generateToken(userDetails.getUuid());       // subject = uuid(불투명)</w:t>
+      </w:r>
+    </w:p>
+    <w:p>
+      <w:pPr>
+        <w:pBdr>
+          <w:left w:val="single" w:color="C0C0C0" w:sz="18" w:space="6"/>
+        </w:pBdr>
+        <w:shd w:fill="F4F4F4" w:color="auto" w:val="clear"/>
+      </w:pPr>
+      <w:r>
+        <w:rPr>
+          <w:rFonts w:ascii="Consolas" w:cs="Consolas" w:eastAsia="Consolas" w:hAnsi="Consolas"/>
+          <w:sz w:val="18"/>
+          <w:szCs w:val="18"/>
+        </w:rPr>
+        <w:t xml:space="preserve"/>
+      </w:r>
+    </w:p>
+    <w:p>
+      <w:pPr>
+        <w:pBdr>
+          <w:left w:val="single" w:color="C0C0C0" w:sz="18" w:space="6"/>
+        </w:pBdr>
+        <w:shd w:fill="F4F4F4" w:color="auto" w:val="clear"/>
+      </w:pPr>
+      <w:r>
+        <w:rPr>
+          <w:rFonts w:ascii="Consolas" w:cs="Consolas" w:eastAsia="Consolas" w:hAnsi="Consolas"/>
+          <w:sz w:val="18"/>
+          <w:szCs w:val="18"/>
+        </w:rPr>
+        <w:t xml:space="preserve">// 검증(JwtAuthenticationFilter) : email 조회 → uuid 조회</w:t>
+      </w:r>
+    </w:p>
+    <w:p>
+      <w:pPr>
+        <w:pBdr>
+          <w:left w:val="single" w:color="C0C0C0" w:sz="18" w:space="6"/>
+        </w:pBdr>
+        <w:shd w:fill="F4F4F4" w:color="auto" w:val="clear"/>
+      </w:pPr>
+      <w:r>
+        <w:rPr>
+          <w:rFonts w:ascii="Consolas" w:cs="Consolas" w:eastAsia="Consolas" w:hAnsi="Consolas"/>
+          <w:sz w:val="18"/>
+          <w:szCs w:val="18"/>
+        </w:rPr>
+        <w:t xml:space="preserve">// Before: loadUserByUsername(extractUsername(token));            // email 로 조회</w:t>
+      </w:r>
+    </w:p>
+    <w:p>
+      <w:pPr>
+        <w:pBdr>
+          <w:left w:val="single" w:color="C0C0C0" w:sz="18" w:space="6"/>
+          <w:bottom w:val="single" w:color="D9D9D9" w:sz="4" w:space="3"/>
+        </w:pBdr>
+        <w:shd w:fill="F4F4F4" w:color="auto" w:val="clear"/>
+      </w:pPr>
+      <w:r>
+        <w:rPr>
+          <w:rFonts w:ascii="Consolas" w:cs="Consolas" w:eastAsia="Consolas" w:hAnsi="Consolas"/>
+          <w:sz w:val="18"/>
+          <w:szCs w:val="18"/>
+        </w:rPr>
+        <w:t xml:space="preserve">// After : loadUserByUuid(extractSubject(token));                 // uuid 로 조회</w:t>
+      </w:r>
+    </w:p>
+    <w:p>
+      <w:pPr>
+        <w:spacing w:after="90" w:line="276"/>
+      </w:pPr>
+      <w:r>
+        <w:rPr>
+          <w:b/>
+          <w:bCs/>
+          <w:sz w:val="22"/>
+          <w:szCs w:val="22"/>
+        </w:rPr>
+        <w:t xml:space="preserve">변경 파일(7곳): </w:t>
+      </w:r>
+      <w:r>
+        <w:rPr>
+          <w:sz w:val="22"/>
+          <w:szCs w:val="22"/>
+        </w:rPr>
+        <w:t xml:space="preserve">UserInfo(uuid 컬럼 + @PrePersist 자동생성) · UserInfoRepository(findByUuid) · UserInfoUserDetails(getUuid, getUsername 은 email 유지) · UserInfoUserDetailsService(loadUserByUuid) · JwtService(generateToken(uuid)·extractSubject·validateToken(token,uuid)) · JwtAuthenticationFilter · UserInfoController</w:t>
+      </w:r>
+    </w:p>
+    <w:p>
+      <w:pPr>
+        <w:spacing w:after="90" w:line="276"/>
+      </w:pPr>
+      <w:r>
+        <w:rPr>
+          <w:b/>
+          <w:bCs/>
+          <w:sz w:val="22"/>
+          <w:szCs w:val="22"/>
+        </w:rPr>
+        <w:t xml:space="preserve">검증 결과</w:t>
+      </w:r>
+      <w:r>
+        <w:rPr>
+          <w:sz w:val="22"/>
+          <w:szCs w:val="22"/>
+        </w:rPr>
+        <w:t xml:space="preserve"> (test 프로파일, 검증됨)</w:t>
+      </w:r>
+    </w:p>
+    <w:tbl>
+      <w:tblPr>
+        <w:tblW w:type="dxa" w:w="9000"/>
+        <w:tblBorders>
+          <w:top w:val="single" w:color="BFBFBF" w:sz="4"/>
+          <w:left w:val="single" w:color="BFBFBF" w:sz="4"/>
+          <w:bottom w:val="single" w:color="BFBFBF" w:sz="4"/>
+          <w:right w:val="single" w:color="BFBFBF" w:sz="4"/>
+          <w:insideH w:val="single" w:color="BFBFBF" w:sz="4"/>
+          <w:insideV w:val="single" w:color="BFBFBF" w:sz="4"/>
+        </w:tblBorders>
+      </w:tblPr>
+      <w:tblGrid>
+        <w:gridCol w:w="5000"/>
+        <w:gridCol w:w="4000"/>
+      </w:tblGrid>
+      <w:tr>
+        <w:trPr>
+          <w:tblHeader/>
+        </w:trPr>
+        <w:tc>
+          <w:tcPr>
+            <w:tcW w:type="dxa" w:w="5000"/>
+            <w:shd w:fill="2E5496" w:color="auto" w:val="clear"/>
+            <w:tcMar>
+              <w:top w:type="dxa" w:w="40"/>
+              <w:left w:type="dxa" w:w="80"/>
+              <w:bottom w:type="dxa" w:w="40"/>
+              <w:right w:type="dxa" w:w="80"/>
+            </w:tcMar>
+          </w:tcPr>
+          <w:p>
+            <w:r>
+              <w:rPr>
+                <w:b/>
+                <w:bCs/>
+                <w:color w:val="FFFFFF"/>
+                <w:sz w:val="18"/>
+                <w:szCs w:val="18"/>
+              </w:rPr>
+              <w:t xml:space="preserve">항목</w:t>
+            </w:r>
+          </w:p>
+        </w:tc>
+        <w:tc>
+          <w:tcPr>
+            <w:tcW w:type="dxa" w:w="4000"/>
+            <w:shd w:fill="2E5496" w:color="auto" w:val="clear"/>
+            <w:tcMar>
+              <w:top w:type="dxa" w:w="40"/>
+              <w:left w:type="dxa" w:w="80"/>
+              <w:bottom w:type="dxa" w:w="40"/>
+              <w:right w:type="dxa" w:w="80"/>
+            </w:tcMar>
+          </w:tcPr>
+          <w:p>
+            <w:r>
+              <w:rPr>
+                <w:b/>
+                <w:bCs/>
+                <w:color w:val="FFFFFF"/>
+                <w:sz w:val="18"/>
+                <w:szCs w:val="18"/>
+              </w:rPr>
+              <w:t xml:space="preserve">결과</w:t>
+            </w:r>
+          </w:p>
+        </w:tc>
+      </w:tr>
+      <w:tr>
+        <w:tc>
+          <w:tcPr>
+            <w:tcW w:type="dxa" w:w="5000"/>
+            <w:tcMar>
+              <w:top w:type="dxa" w:w="40"/>
+              <w:left w:type="dxa" w:w="80"/>
+              <w:bottom w:type="dxa" w:w="40"/>
+              <w:right w:type="dxa" w:w="80"/>
+            </w:tcMar>
+          </w:tcPr>
+          <w:p>
+            <w:r>
+              <w:rPr>
+                <w:sz w:val="18"/>
+                <w:szCs w:val="18"/>
+              </w:rPr>
+              <w:t xml:space="preserve">로그인 토큰의 payload</w:t>
+            </w:r>
+          </w:p>
+        </w:tc>
+        <w:tc>
+          <w:tcPr>
+            <w:tcW w:type="dxa" w:w="4000"/>
+            <w:tcMar>
+              <w:top w:type="dxa" w:w="40"/>
+              <w:left w:type="dxa" w:w="80"/>
+              <w:bottom w:type="dxa" w:w="40"/>
+              <w:right w:type="dxa" w:w="80"/>
+            </w:tcMar>
+          </w:tcPr>
+          <w:p>
+            <w:r>
+              <w:rPr>
+                <w:color w:val="2E7D32"/>
+                <w:sz w:val="18"/>
+                <w:szCs w:val="18"/>
+              </w:rPr>
+              <w:t xml:space="preserve">{"sub":"&lt;uuid&gt;",..} → email 없음</w:t>
+            </w:r>
+          </w:p>
+        </w:tc>
+      </w:tr>
+      <w:tr>
+        <w:tc>
+          <w:tcPr>
+            <w:tcW w:type="dxa" w:w="5000"/>
+            <w:tcMar>
+              <w:top w:type="dxa" w:w="40"/>
+              <w:left w:type="dxa" w:w="80"/>
+              <w:bottom w:type="dxa" w:w="40"/>
+              <w:right w:type="dxa" w:w="80"/>
+            </w:tcMar>
+          </w:tcPr>
+          <w:p>
+            <w:r>
+              <w:rPr>
+                <w:sz w:val="18"/>
+                <w:szCs w:val="18"/>
+              </w:rPr>
+              <w:t xml:space="preserve">정상 토큰으로 /me</w:t>
+            </w:r>
+          </w:p>
+        </w:tc>
+        <w:tc>
+          <w:tcPr>
+            <w:tcW w:type="dxa" w:w="4000"/>
+            <w:tcMar>
+              <w:top w:type="dxa" w:w="40"/>
+              <w:left w:type="dxa" w:w="80"/>
+              <w:bottom w:type="dxa" w:w="40"/>
+              <w:right w:type="dxa" w:w="80"/>
+            </w:tcMar>
+          </w:tcPr>
+          <w:p>
+            <w:r>
+              <w:rPr>
+                <w:color w:val="2E7D32"/>
+                <w:sz w:val="18"/>
+                <w:szCs w:val="18"/>
+              </w:rPr>
+              <w:t xml:space="preserve">200 (uuid 조회로 정상 인증)</w:t>
+            </w:r>
+          </w:p>
+        </w:tc>
+      </w:tr>
+      <w:tr>
+        <w:tc>
+          <w:tcPr>
+            <w:tcW w:type="dxa" w:w="5000"/>
+            <w:tcMar>
+              <w:top w:type="dxa" w:w="40"/>
+              <w:left w:type="dxa" w:w="80"/>
+              <w:bottom w:type="dxa" w:w="40"/>
+              <w:right w:type="dxa" w:w="80"/>
+            </w:tcMar>
+          </w:tcPr>
+          <w:p>
+            <w:r>
+              <w:rPr>
+                <w:sz w:val="18"/>
+                <w:szCs w:val="18"/>
+              </w:rPr>
+              <w:t xml:space="preserve">예전 방식 위조(subject=email)</w:t>
+            </w:r>
+          </w:p>
+        </w:tc>
+        <w:tc>
+          <w:tcPr>
+            <w:tcW w:type="dxa" w:w="4000"/>
+            <w:tcMar>
+              <w:top w:type="dxa" w:w="40"/>
+              <w:left w:type="dxa" w:w="80"/>
+              <w:bottom w:type="dxa" w:w="40"/>
+              <w:right w:type="dxa" w:w="80"/>
+            </w:tcMar>
+          </w:tcPr>
+          <w:p>
+            <w:r>
+              <w:rPr>
+                <w:color w:val="2E7D32"/>
+                <w:sz w:val="18"/>
+                <w:szCs w:val="18"/>
+              </w:rPr>
+              <w:t xml:space="preserve">401 (uuid 아님 → 사용자 없음)</w:t>
+            </w:r>
+          </w:p>
+        </w:tc>
+      </w:tr>
+      <w:tr>
+        <w:tc>
+          <w:tcPr>
+            <w:tcW w:type="dxa" w:w="5000"/>
+            <w:tcMar>
+              <w:top w:type="dxa" w:w="40"/>
+              <w:left w:type="dxa" w:w="80"/>
+              <w:bottom w:type="dxa" w:w="40"/>
+              <w:right w:type="dxa" w:w="80"/>
+            </w:tcMar>
+          </w:tcPr>
+          <w:p>
+            <w:r>
+              <w:rPr>
+                <w:sz w:val="18"/>
+                <w:szCs w:val="18"/>
+              </w:rPr>
+              <w:t xml:space="preserve">랜덤 uuid 위조</w:t>
+            </w:r>
+          </w:p>
+        </w:tc>
+        <w:tc>
+          <w:tcPr>
+            <w:tcW w:type="dxa" w:w="4000"/>
+            <w:tcMar>
+              <w:top w:type="dxa" w:w="40"/>
+              <w:left w:type="dxa" w:w="80"/>
+              <w:bottom w:type="dxa" w:w="40"/>
+              <w:right w:type="dxa" w:w="80"/>
+            </w:tcMar>
+          </w:tcPr>
+          <w:p>
+            <w:r>
+              <w:rPr>
+                <w:color w:val="2E7D32"/>
+                <w:sz w:val="18"/>
+                <w:szCs w:val="18"/>
+              </w:rPr>
+              <w:t xml:space="preserve">401 (그런 사용자 없음)</w:t>
+            </w:r>
+          </w:p>
+        </w:tc>
+      </w:tr>
+    </w:tbl>
     <w:p>
       <w:pPr>
         <w:pStyle w:val="ListParagraph"/>
@@ -2248,7 +2674,7 @@
           <w:sz w:val="22"/>
           <w:szCs w:val="22"/>
         </w:rPr>
-        <w:t xml:space="preserve">소스·application.properties 에 실제 secret 을 두지 않는다(env/시크릿 매니저)</w:t>
+        <w:t xml:space="preserve">토큰에 PII(email)가 남지 않는다 → 노출돼도 로그인 식별자가 드러나지 않음</w:t>
       </w:r>
     </w:p>
     <w:p>
@@ -2265,7 +2691,7 @@
           <w:sz w:val="22"/>
           <w:szCs w:val="22"/>
         </w:rPr>
-        <w:t xml:space="preserve">충분히 길고 무작위(HS256 ≥ 32바이트, 권장 더 길게), 서비스별로 다르게</w:t>
+        <w:t xml:space="preserve">email 을 바꿔도 토큰에 영향 없음(식별자 분리)</w:t>
       </w:r>
     </w:p>
     <w:p>
@@ -2282,7 +2708,21 @@
           <w:sz w:val="22"/>
           <w:szCs w:val="22"/>
         </w:rPr>
-        <w:t xml:space="preserve">주기적 로테이션 + 유출 시 즉시 교체(교체하면 기존 토큰 전부 무효)</w:t>
+        <w:t xml:space="preserve">방어 심화: secret 이 유출돼도 유효한 uuid 를 알아야 위조가 통한다(uuid 는 응답으로 노출 안 함)</w:t>
+      </w:r>
+    </w:p>
+    <w:p>
+      <w:pPr>
+        <w:spacing w:after="90" w:line="276"/>
+      </w:pPr>
+      <w:r>
+        <w:rPr>
+          <w:i/>
+          <w:iCs/>
+          <w:sz w:val="22"/>
+          <w:szCs w:val="22"/>
+        </w:rPr>
+        <w:t xml:space="preserve">주의: 이는 payload 최소화이지 암호화가 아니다. uuid 도 base64 로 보이므로 민감정보는 여전히 넣지 않는다.</w:t>
       </w:r>
     </w:p>
     <w:p>
@@ -2297,7 +2737,73 @@
           <w:sz w:val="21"/>
           <w:szCs w:val="21"/>
         </w:rPr>
-        <w:t xml:space="preserve">4-3. 토큰 무효화 부재 → 짧은 만료 (개념)</w:t>
+        <w:t xml:space="preserve">4-3. Secret 관리 원칙</w:t>
+      </w:r>
+    </w:p>
+    <w:p>
+      <w:pPr>
+        <w:pStyle w:val="ListParagraph"/>
+        <w:numPr>
+          <w:ilvl w:val="0"/>
+          <w:numId w:val="1"/>
+        </w:numPr>
+        <w:spacing w:after="90" w:line="276"/>
+      </w:pPr>
+      <w:r>
+        <w:rPr>
+          <w:sz w:val="22"/>
+          <w:szCs w:val="22"/>
+        </w:rPr>
+        <w:t xml:space="preserve">소스·application.properties 에 실제 secret 을 두지 않는다(env/시크릿 매니저)</w:t>
+      </w:r>
+    </w:p>
+    <w:p>
+      <w:pPr>
+        <w:pStyle w:val="ListParagraph"/>
+        <w:numPr>
+          <w:ilvl w:val="0"/>
+          <w:numId w:val="1"/>
+        </w:numPr>
+        <w:spacing w:after="90" w:line="276"/>
+      </w:pPr>
+      <w:r>
+        <w:rPr>
+          <w:sz w:val="22"/>
+          <w:szCs w:val="22"/>
+        </w:rPr>
+        <w:t xml:space="preserve">충분히 길고 무작위(HS256 ≥ 32바이트, 권장 더 길게), 서비스별로 다르게</w:t>
+      </w:r>
+    </w:p>
+    <w:p>
+      <w:pPr>
+        <w:pStyle w:val="ListParagraph"/>
+        <w:numPr>
+          <w:ilvl w:val="0"/>
+          <w:numId w:val="1"/>
+        </w:numPr>
+        <w:spacing w:after="90" w:line="276"/>
+      </w:pPr>
+      <w:r>
+        <w:rPr>
+          <w:sz w:val="22"/>
+          <w:szCs w:val="22"/>
+        </w:rPr>
+        <w:t xml:space="preserve">주기적 로테이션 + 유출 시 즉시 교체(교체하면 기존 토큰 전부 무효)</w:t>
+      </w:r>
+    </w:p>
+    <w:p>
+      <w:pPr>
+        <w:spacing w:after="80" w:before="180"/>
+      </w:pPr>
+      <w:r>
+        <w:rPr>
+          <w:b/>
+          <w:bCs/>
+          <w:color w:val="2E5496"/>
+          <w:sz w:val="21"/>
+          <w:szCs w:val="21"/>
+        </w:rPr>
+        <w:t xml:space="preserve">4-4. 토큰 무효화 부재 → 짧은 만료 (개념)</w:t>
       </w:r>
     </w:p>
     <w:p>
@@ -2586,7 +3092,7 @@
                 <w:sz w:val="18"/>
                 <w:szCs w:val="18"/>
               </w:rPr>
-              <w:t xml:space="preserve">민감정보 미포함(서명일 뿐 암호화 아님)</w:t>
+              <w:t xml:space="preserve">민감정보 미포함(서명일 뿐 암호화 아님). subject를 email→uuid(불투명)로 교체</w:t>
             </w:r>
           </w:p>
         </w:tc>

</xml_diff>

<commit_message>
[Docs] JWT 5-2(PII): PII 설명 + 수정 한눈에 보기 표 + Before/After 정리
- PII(개인 식별 정보) 정의 추가(payload는 base64라 PII 금지 원칙).
- '수정 요약 — 한눈에 보기' 표(파일 | 구분(추가/수정) | 한 일) 7곳 정리.
- 핵심 로직 Before/After를 ①발급 ②검증 2곳으로 명확히 분리.
- md·docx 동일 반영.
</commit_message>
<xml_diff>
--- a/docs/security/06_JWT_Security.docx
+++ b/docs/security/06_JWT_Security.docx
@@ -2121,10 +2121,594 @@
           <w:b/>
           <w:bCs/>
         </w:rPr>
+        <w:t xml:space="preserve">PII(Personally Identifiable Information, 개인 식별 정보)란? </w:t>
+      </w:r>
+      <w:r>
+        <w:t xml:space="preserve">특정 개인을 직접(이름·주민번호·email·전화번호) 또는 간접(생년월일·주소·IP)으로 알아볼 수 있는 정보. JWT payload 는 암호화가 아니라 base64 라 누구나 읽을 수 있으므로, 토큰·로그·URL 처럼 노출되기 쉬운 곳에는 PII 를 넣지 않는 것이 원칙이다.</w:t>
+      </w:r>
+    </w:p>
+    <w:p>
+      <w:pPr>
+        <w:spacing w:after="80" w:line="272" w:lineRule="auto"/>
+      </w:pPr>
+      <w:r>
+        <w:rPr>
+          <w:b/>
+          <w:bCs/>
+        </w:rPr>
         <w:t xml:space="preserve">이번에 수정한 코드 ②. </w:t>
       </w:r>
       <w:r>
-        <w:t xml:space="preserve">payload 는 공개이므로 email(PII) 대신 불투명 식별자(UserInfo.uuid)를 subject 로 담고, 필터는 uuid 로 사용자를 조회한다.</w:t>
+        <w:t xml:space="preserve">로그인에 쓰는 email(PII) 대신 의미 없는 불투명 식별자(UserInfo.uuid)를 토큰 subject 로 담고, 필터는 그 uuid 로 사용자를 조회한다.</w:t>
+      </w:r>
+    </w:p>
+    <w:p>
+      <w:pPr>
+        <w:spacing w:after="80" w:line="272" w:lineRule="auto"/>
+      </w:pPr>
+      <w:r>
+        <w:rPr>
+          <w:b/>
+          <w:bCs/>
+        </w:rPr>
+        <w:t xml:space="preserve">수정 요약 — 한눈에 보기 (7곳)</w:t>
+      </w:r>
+    </w:p>
+    <w:tbl>
+      <w:tblPr>
+        <w:tblW w:w="9000" w:type="dxa"/>
+        <w:tblBorders>
+          <w:top w:val="single" w:sz="4" w:space="0" w:color="BFBFBF"/>
+          <w:left w:val="single" w:sz="4" w:space="0" w:color="BFBFBF"/>
+          <w:bottom w:val="single" w:sz="4" w:space="0" w:color="BFBFBF"/>
+          <w:right w:val="single" w:sz="4" w:space="0" w:color="BFBFBF"/>
+          <w:insideH w:val="single" w:sz="4" w:space="0" w:color="BFBFBF"/>
+          <w:insideV w:val="single" w:sz="4" w:space="0" w:color="BFBFBF"/>
+        </w:tblBorders>
+        <w:tblLook w:val="04A0" w:firstRow="1" w:lastRow="0" w:firstColumn="1" w:lastColumn="0" w:noHBand="0" w:noVBand="1"/>
+      </w:tblPr>
+      <w:tblGrid>
+        <w:gridCol w:w="2900"/>
+        <w:gridCol w:w="800"/>
+        <w:gridCol w:w="5300"/>
+      </w:tblGrid>
+      <w:tr>
+        <w:trPr>
+          <w:tblHeader/>
+        </w:trPr>
+        <w:tc>
+          <w:tcPr>
+            <w:tcW w:w="2900" w:type="dxa"/>
+            <w:shd w:val="clear" w:color="auto" w:fill="2E5496"/>
+            <w:tcMar>
+              <w:top w:w="40" w:type="dxa"/>
+              <w:left w:w="80" w:type="dxa"/>
+              <w:bottom w:w="40" w:type="dxa"/>
+              <w:right w:w="80" w:type="dxa"/>
+            </w:tcMar>
+          </w:tcPr>
+          <w:p>
+            <w:r>
+              <w:rPr>
+                <w:b/>
+                <w:bCs/>
+                <w:color w:val="FFFFFF"/>
+                <w:sz w:val="18"/>
+                <w:szCs w:val="18"/>
+              </w:rPr>
+              <w:t xml:space="preserve">파일</w:t>
+            </w:r>
+          </w:p>
+        </w:tc>
+        <w:tc>
+          <w:tcPr>
+            <w:tcW w:w="800" w:type="dxa"/>
+            <w:shd w:val="clear" w:color="auto" w:fill="2E5496"/>
+            <w:tcMar>
+              <w:top w:w="40" w:type="dxa"/>
+              <w:left w:w="80" w:type="dxa"/>
+              <w:bottom w:w="40" w:type="dxa"/>
+              <w:right w:w="80" w:type="dxa"/>
+            </w:tcMar>
+          </w:tcPr>
+          <w:p>
+            <w:r>
+              <w:rPr>
+                <w:b/>
+                <w:bCs/>
+                <w:color w:val="FFFFFF"/>
+                <w:sz w:val="18"/>
+                <w:szCs w:val="18"/>
+              </w:rPr>
+              <w:t xml:space="preserve">구분</w:t>
+            </w:r>
+          </w:p>
+        </w:tc>
+        <w:tc>
+          <w:tcPr>
+            <w:tcW w:w="5300" w:type="dxa"/>
+            <w:shd w:val="clear" w:color="auto" w:fill="2E5496"/>
+            <w:tcMar>
+              <w:top w:w="40" w:type="dxa"/>
+              <w:left w:w="80" w:type="dxa"/>
+              <w:bottom w:w="40" w:type="dxa"/>
+              <w:right w:w="80" w:type="dxa"/>
+            </w:tcMar>
+          </w:tcPr>
+          <w:p>
+            <w:r>
+              <w:rPr>
+                <w:b/>
+                <w:bCs/>
+                <w:color w:val="FFFFFF"/>
+                <w:sz w:val="18"/>
+                <w:szCs w:val="18"/>
+              </w:rPr>
+              <w:t xml:space="preserve">한 일</w:t>
+            </w:r>
+          </w:p>
+        </w:tc>
+      </w:tr>
+      <w:tr>
+        <w:tc>
+          <w:tcPr>
+            <w:tcW w:w="2900" w:type="dxa"/>
+            <w:tcMar>
+              <w:top w:w="40" w:type="dxa"/>
+              <w:left w:w="80" w:type="dxa"/>
+              <w:bottom w:w="40" w:type="dxa"/>
+              <w:right w:w="80" w:type="dxa"/>
+            </w:tcMar>
+          </w:tcPr>
+          <w:p>
+            <w:r>
+              <w:rPr>
+                <w:sz w:val="18"/>
+                <w:szCs w:val="18"/>
+              </w:rPr>
+              <w:t xml:space="preserve">UserInfo</w:t>
+            </w:r>
+          </w:p>
+        </w:tc>
+        <w:tc>
+          <w:tcPr>
+            <w:tcW w:w="800" w:type="dxa"/>
+            <w:tcMar>
+              <w:top w:w="40" w:type="dxa"/>
+              <w:left w:w="80" w:type="dxa"/>
+              <w:bottom w:w="40" w:type="dxa"/>
+              <w:right w:w="80" w:type="dxa"/>
+            </w:tcMar>
+          </w:tcPr>
+          <w:p>
+            <w:r>
+              <w:rPr>
+                <w:sz w:val="18"/>
+                <w:szCs w:val="18"/>
+              </w:rPr>
+              <w:t xml:space="preserve">수정</w:t>
+            </w:r>
+          </w:p>
+        </w:tc>
+        <w:tc>
+          <w:tcPr>
+            <w:tcW w:w="5300" w:type="dxa"/>
+            <w:tcMar>
+              <w:top w:w="40" w:type="dxa"/>
+              <w:left w:w="80" w:type="dxa"/>
+              <w:bottom w:w="40" w:type="dxa"/>
+              <w:right w:w="80" w:type="dxa"/>
+            </w:tcMar>
+          </w:tcPr>
+          <w:p>
+            <w:r>
+              <w:rPr>
+                <w:sz w:val="18"/>
+                <w:szCs w:val="18"/>
+              </w:rPr>
+              <w:t xml:space="preserve">uuid 컬럼 추가 + @PrePersist 로 저장 직전 자동 생성(시드·회원가입 공통)</w:t>
+            </w:r>
+          </w:p>
+        </w:tc>
+      </w:tr>
+      <w:tr>
+        <w:tc>
+          <w:tcPr>
+            <w:tcW w:w="2900" w:type="dxa"/>
+            <w:tcMar>
+              <w:top w:w="40" w:type="dxa"/>
+              <w:left w:w="80" w:type="dxa"/>
+              <w:bottom w:w="40" w:type="dxa"/>
+              <w:right w:w="80" w:type="dxa"/>
+            </w:tcMar>
+          </w:tcPr>
+          <w:p>
+            <w:r>
+              <w:rPr>
+                <w:sz w:val="18"/>
+                <w:szCs w:val="18"/>
+              </w:rPr>
+              <w:t xml:space="preserve">UserInfoRepository</w:t>
+            </w:r>
+          </w:p>
+        </w:tc>
+        <w:tc>
+          <w:tcPr>
+            <w:tcW w:w="800" w:type="dxa"/>
+            <w:tcMar>
+              <w:top w:w="40" w:type="dxa"/>
+              <w:left w:w="80" w:type="dxa"/>
+              <w:bottom w:w="40" w:type="dxa"/>
+              <w:right w:w="80" w:type="dxa"/>
+            </w:tcMar>
+          </w:tcPr>
+          <w:p>
+            <w:r>
+              <w:rPr>
+                <w:sz w:val="18"/>
+                <w:szCs w:val="18"/>
+              </w:rPr>
+              <w:t xml:space="preserve">추가</w:t>
+            </w:r>
+          </w:p>
+        </w:tc>
+        <w:tc>
+          <w:tcPr>
+            <w:tcW w:w="5300" w:type="dxa"/>
+            <w:tcMar>
+              <w:top w:w="40" w:type="dxa"/>
+              <w:left w:w="80" w:type="dxa"/>
+              <w:bottom w:w="40" w:type="dxa"/>
+              <w:right w:w="80" w:type="dxa"/>
+            </w:tcMar>
+          </w:tcPr>
+          <w:p>
+            <w:r>
+              <w:rPr>
+                <w:sz w:val="18"/>
+                <w:szCs w:val="18"/>
+              </w:rPr>
+              <w:t xml:space="preserve">findByUuid(uuid) — uuid 로 사용자 조회</w:t>
+            </w:r>
+          </w:p>
+        </w:tc>
+      </w:tr>
+      <w:tr>
+        <w:tc>
+          <w:tcPr>
+            <w:tcW w:w="2900" w:type="dxa"/>
+            <w:tcMar>
+              <w:top w:w="40" w:type="dxa"/>
+              <w:left w:w="80" w:type="dxa"/>
+              <w:bottom w:w="40" w:type="dxa"/>
+              <w:right w:w="80" w:type="dxa"/>
+            </w:tcMar>
+          </w:tcPr>
+          <w:p>
+            <w:r>
+              <w:rPr>
+                <w:sz w:val="18"/>
+                <w:szCs w:val="18"/>
+              </w:rPr>
+              <w:t xml:space="preserve">UserInfoUserDetails</w:t>
+            </w:r>
+          </w:p>
+        </w:tc>
+        <w:tc>
+          <w:tcPr>
+            <w:tcW w:w="800" w:type="dxa"/>
+            <w:tcMar>
+              <w:top w:w="40" w:type="dxa"/>
+              <w:left w:w="80" w:type="dxa"/>
+              <w:bottom w:w="40" w:type="dxa"/>
+              <w:right w:w="80" w:type="dxa"/>
+            </w:tcMar>
+          </w:tcPr>
+          <w:p>
+            <w:r>
+              <w:rPr>
+                <w:sz w:val="18"/>
+                <w:szCs w:val="18"/>
+              </w:rPr>
+              <w:t xml:space="preserve">수정</w:t>
+            </w:r>
+          </w:p>
+        </w:tc>
+        <w:tc>
+          <w:tcPr>
+            <w:tcW w:w="5300" w:type="dxa"/>
+            <w:tcMar>
+              <w:top w:w="40" w:type="dxa"/>
+              <w:left w:w="80" w:type="dxa"/>
+              <w:bottom w:w="40" w:type="dxa"/>
+              <w:right w:w="80" w:type="dxa"/>
+            </w:tcMar>
+          </w:tcPr>
+          <w:p>
+            <w:r>
+              <w:rPr>
+                <w:sz w:val="18"/>
+                <w:szCs w:val="18"/>
+              </w:rPr>
+              <w:t xml:space="preserve">getUuid() 추가. getUsername()=email 은 그대로 유지(기존 코드 보호)</w:t>
+            </w:r>
+          </w:p>
+        </w:tc>
+      </w:tr>
+      <w:tr>
+        <w:tc>
+          <w:tcPr>
+            <w:tcW w:w="2900" w:type="dxa"/>
+            <w:tcMar>
+              <w:top w:w="40" w:type="dxa"/>
+              <w:left w:w="80" w:type="dxa"/>
+              <w:bottom w:w="40" w:type="dxa"/>
+              <w:right w:w="80" w:type="dxa"/>
+            </w:tcMar>
+          </w:tcPr>
+          <w:p>
+            <w:r>
+              <w:rPr>
+                <w:sz w:val="18"/>
+                <w:szCs w:val="18"/>
+              </w:rPr>
+              <w:t xml:space="preserve">UserInfoUserDetailsService</w:t>
+            </w:r>
+          </w:p>
+        </w:tc>
+        <w:tc>
+          <w:tcPr>
+            <w:tcW w:w="800" w:type="dxa"/>
+            <w:tcMar>
+              <w:top w:w="40" w:type="dxa"/>
+              <w:left w:w="80" w:type="dxa"/>
+              <w:bottom w:w="40" w:type="dxa"/>
+              <w:right w:w="80" w:type="dxa"/>
+            </w:tcMar>
+          </w:tcPr>
+          <w:p>
+            <w:r>
+              <w:rPr>
+                <w:sz w:val="18"/>
+                <w:szCs w:val="18"/>
+              </w:rPr>
+              <w:t xml:space="preserve">추가</w:t>
+            </w:r>
+          </w:p>
+        </w:tc>
+        <w:tc>
+          <w:tcPr>
+            <w:tcW w:w="5300" w:type="dxa"/>
+            <w:tcMar>
+              <w:top w:w="40" w:type="dxa"/>
+              <w:left w:w="80" w:type="dxa"/>
+              <w:bottom w:w="40" w:type="dxa"/>
+              <w:right w:w="80" w:type="dxa"/>
+            </w:tcMar>
+          </w:tcPr>
+          <w:p>
+            <w:r>
+              <w:rPr>
+                <w:sz w:val="18"/>
+                <w:szCs w:val="18"/>
+              </w:rPr>
+              <w:t xml:space="preserve">loadUserByUuid(uuid) — JWT 필터 전용 조회(폼 로그인은 email)</w:t>
+            </w:r>
+          </w:p>
+        </w:tc>
+      </w:tr>
+      <w:tr>
+        <w:tc>
+          <w:tcPr>
+            <w:tcW w:w="2900" w:type="dxa"/>
+            <w:tcMar>
+              <w:top w:w="40" w:type="dxa"/>
+              <w:left w:w="80" w:type="dxa"/>
+              <w:bottom w:w="40" w:type="dxa"/>
+              <w:right w:w="80" w:type="dxa"/>
+            </w:tcMar>
+          </w:tcPr>
+          <w:p>
+            <w:r>
+              <w:rPr>
+                <w:sz w:val="18"/>
+                <w:szCs w:val="18"/>
+              </w:rPr>
+              <w:t xml:space="preserve">JwtService</w:t>
+            </w:r>
+          </w:p>
+        </w:tc>
+        <w:tc>
+          <w:tcPr>
+            <w:tcW w:w="800" w:type="dxa"/>
+            <w:tcMar>
+              <w:top w:w="40" w:type="dxa"/>
+              <w:left w:w="80" w:type="dxa"/>
+              <w:bottom w:w="40" w:type="dxa"/>
+              <w:right w:w="80" w:type="dxa"/>
+            </w:tcMar>
+          </w:tcPr>
+          <w:p>
+            <w:r>
+              <w:rPr>
+                <w:sz w:val="18"/>
+                <w:szCs w:val="18"/>
+              </w:rPr>
+              <w:t xml:space="preserve">수정</w:t>
+            </w:r>
+          </w:p>
+        </w:tc>
+        <w:tc>
+          <w:tcPr>
+            <w:tcW w:w="5300" w:type="dxa"/>
+            <w:tcMar>
+              <w:top w:w="40" w:type="dxa"/>
+              <w:left w:w="80" w:type="dxa"/>
+              <w:bottom w:w="40" w:type="dxa"/>
+              <w:right w:w="80" w:type="dxa"/>
+            </w:tcMar>
+          </w:tcPr>
+          <w:p>
+            <w:r>
+              <w:rPr>
+                <w:sz w:val="18"/>
+                <w:szCs w:val="18"/>
+              </w:rPr>
+              <w:t xml:space="preserve">generateToken(uuid), extractUsername→extractSubject, validateToken(token, uuid)</w:t>
+            </w:r>
+          </w:p>
+        </w:tc>
+      </w:tr>
+      <w:tr>
+        <w:tc>
+          <w:tcPr>
+            <w:tcW w:w="2900" w:type="dxa"/>
+            <w:tcMar>
+              <w:top w:w="40" w:type="dxa"/>
+              <w:left w:w="80" w:type="dxa"/>
+              <w:bottom w:w="40" w:type="dxa"/>
+              <w:right w:w="80" w:type="dxa"/>
+            </w:tcMar>
+          </w:tcPr>
+          <w:p>
+            <w:r>
+              <w:rPr>
+                <w:sz w:val="18"/>
+                <w:szCs w:val="18"/>
+              </w:rPr>
+              <w:t xml:space="preserve">JwtAuthenticationFilter</w:t>
+            </w:r>
+          </w:p>
+        </w:tc>
+        <w:tc>
+          <w:tcPr>
+            <w:tcW w:w="800" w:type="dxa"/>
+            <w:tcMar>
+              <w:top w:w="40" w:type="dxa"/>
+              <w:left w:w="80" w:type="dxa"/>
+              <w:bottom w:w="40" w:type="dxa"/>
+              <w:right w:w="80" w:type="dxa"/>
+            </w:tcMar>
+          </w:tcPr>
+          <w:p>
+            <w:r>
+              <w:rPr>
+                <w:sz w:val="18"/>
+                <w:szCs w:val="18"/>
+              </w:rPr>
+              <w:t xml:space="preserve">수정</w:t>
+            </w:r>
+          </w:p>
+        </w:tc>
+        <w:tc>
+          <w:tcPr>
+            <w:tcW w:w="5300" w:type="dxa"/>
+            <w:tcMar>
+              <w:top w:w="40" w:type="dxa"/>
+              <w:left w:w="80" w:type="dxa"/>
+              <w:bottom w:w="40" w:type="dxa"/>
+              <w:right w:w="80" w:type="dxa"/>
+            </w:tcMar>
+          </w:tcPr>
+          <w:p>
+            <w:r>
+              <w:rPr>
+                <w:sz w:val="18"/>
+                <w:szCs w:val="18"/>
+              </w:rPr>
+              <w:t xml:space="preserve">email 조회 → uuid 조회로 변경</w:t>
+            </w:r>
+          </w:p>
+        </w:tc>
+      </w:tr>
+      <w:tr>
+        <w:tc>
+          <w:tcPr>
+            <w:tcW w:w="2900" w:type="dxa"/>
+            <w:tcMar>
+              <w:top w:w="40" w:type="dxa"/>
+              <w:left w:w="80" w:type="dxa"/>
+              <w:bottom w:w="40" w:type="dxa"/>
+              <w:right w:w="80" w:type="dxa"/>
+            </w:tcMar>
+          </w:tcPr>
+          <w:p>
+            <w:r>
+              <w:rPr>
+                <w:sz w:val="18"/>
+                <w:szCs w:val="18"/>
+              </w:rPr>
+              <w:t xml:space="preserve">UserInfoController</w:t>
+            </w:r>
+          </w:p>
+        </w:tc>
+        <w:tc>
+          <w:tcPr>
+            <w:tcW w:w="800" w:type="dxa"/>
+            <w:tcMar>
+              <w:top w:w="40" w:type="dxa"/>
+              <w:left w:w="80" w:type="dxa"/>
+              <w:bottom w:w="40" w:type="dxa"/>
+              <w:right w:w="80" w:type="dxa"/>
+            </w:tcMar>
+          </w:tcPr>
+          <w:p>
+            <w:r>
+              <w:rPr>
+                <w:sz w:val="18"/>
+                <w:szCs w:val="18"/>
+              </w:rPr>
+              <w:t xml:space="preserve">수정</w:t>
+            </w:r>
+          </w:p>
+        </w:tc>
+        <w:tc>
+          <w:tcPr>
+            <w:tcW w:w="5300" w:type="dxa"/>
+            <w:tcMar>
+              <w:top w:w="40" w:type="dxa"/>
+              <w:left w:w="80" w:type="dxa"/>
+              <w:bottom w:w="40" w:type="dxa"/>
+              <w:right w:w="80" w:type="dxa"/>
+            </w:tcMar>
+          </w:tcPr>
+          <w:p>
+            <w:r>
+              <w:rPr>
+                <w:sz w:val="18"/>
+                <w:szCs w:val="18"/>
+              </w:rPr>
+              <w:t xml:space="preserve">로그인 성공 시 토큰 subject = uuid</w:t>
+            </w:r>
+          </w:p>
+        </w:tc>
+      </w:tr>
+    </w:tbl>
+    <w:p>
+      <w:pPr>
+        <w:spacing w:after="80" w:line="272" w:lineRule="auto"/>
+      </w:pPr>
+      <w:r>
+        <w:rPr>
+          <w:b/>
+          <w:bCs/>
+        </w:rPr>
+        <w:t xml:space="preserve">핵심 로직 Before → After</w:t>
+      </w:r>
+      <w:r>
+        <w:t xml:space="preserve">  (엔티티·레포·서비스는 새로 추가된 코드라 Before 없음)</w:t>
+      </w:r>
+    </w:p>
+    <w:p>
+      <w:pPr>
+        <w:spacing w:after="80" w:line="272" w:lineRule="auto"/>
+      </w:pPr>
+      <w:r>
+        <w:rPr>
+          <w:b/>
+          <w:bCs/>
+        </w:rPr>
+        <w:t xml:space="preserve">① 발급 (UserInfoController)</w:t>
       </w:r>
     </w:p>
     <w:p>
@@ -2141,7 +2725,7 @@
           <w:sz w:val="18"/>
           <w:szCs w:val="18"/>
         </w:rPr>
-        <w:t xml:space="preserve">// 발급(UserInfoController)</w:t>
+        <w:t xml:space="preserve">// Before</w:t>
       </w:r>
     </w:p>
     <w:p>
@@ -2157,7 +2741,7 @@
           <w:sz w:val="18"/>
           <w:szCs w:val="18"/>
         </w:rPr>
-        <w:t xml:space="preserve">// Before: generateToken(userDetails.getUsername());   // subject = email(PII)</w:t>
+        <w:t xml:space="preserve">String token = jwtService.generateToken(userDetails.getUsername());  // subject = email(PII)</w:t>
       </w:r>
     </w:p>
     <w:p>
@@ -2173,55 +2757,7 @@
           <w:sz w:val="18"/>
           <w:szCs w:val="18"/>
         </w:rPr>
-        <w:t xml:space="preserve">// After : generateToken(userDetails.getUuid());       // subject = uuid(불투명)</w:t>
-      </w:r>
-    </w:p>
-    <w:p>
-      <w:pPr>
-        <w:pBdr>
-          <w:left w:val="single" w:sz="18" w:space="6" w:color="C0C0C0"/>
-        </w:pBdr>
-        <w:shd w:val="clear" w:color="auto" w:fill="F4F4F4"/>
-      </w:pPr>
-      <w:r>
-        <w:rPr>
-          <w:rFonts w:ascii="Consolas" w:hAnsi="Consolas"/>
-          <w:sz w:val="18"/>
-          <w:szCs w:val="18"/>
-        </w:rPr>
-        <w:t xml:space="preserve"/>
-      </w:r>
-    </w:p>
-    <w:p>
-      <w:pPr>
-        <w:pBdr>
-          <w:left w:val="single" w:sz="18" w:space="6" w:color="C0C0C0"/>
-        </w:pBdr>
-        <w:shd w:val="clear" w:color="auto" w:fill="F4F4F4"/>
-      </w:pPr>
-      <w:r>
-        <w:rPr>
-          <w:rFonts w:ascii="Consolas" w:hAnsi="Consolas"/>
-          <w:sz w:val="18"/>
-          <w:szCs w:val="18"/>
-        </w:rPr>
-        <w:t xml:space="preserve">// 검증(JwtAuthenticationFilter)</w:t>
-      </w:r>
-    </w:p>
-    <w:p>
-      <w:pPr>
-        <w:pBdr>
-          <w:left w:val="single" w:sz="18" w:space="6" w:color="C0C0C0"/>
-        </w:pBdr>
-        <w:shd w:val="clear" w:color="auto" w:fill="F4F4F4"/>
-      </w:pPr>
-      <w:r>
-        <w:rPr>
-          <w:rFonts w:ascii="Consolas" w:hAnsi="Consolas"/>
-          <w:sz w:val="18"/>
-          <w:szCs w:val="18"/>
-        </w:rPr>
-        <w:t xml:space="preserve">// Before: loadUserByUsername(extractUsername(token));  // email 로 조회</w:t>
+        <w:t xml:space="preserve">// After</w:t>
       </w:r>
     </w:p>
     <w:p>
@@ -2238,7 +2774,7 @@
           <w:sz w:val="18"/>
           <w:szCs w:val="18"/>
         </w:rPr>
-        <w:t xml:space="preserve">// After : loadUserByUuid(extractSubject(token));       // uuid 로 조회</w:t>
+        <w:t xml:space="preserve">String token = jwtService.generateToken(userDetails.getUuid());      // subject = uuid(불투명)</w:t>
       </w:r>
     </w:p>
     <w:p>
@@ -2250,10 +2786,105 @@
           <w:b/>
           <w:bCs/>
         </w:rPr>
-        <w:t xml:space="preserve">변경 파일(7곳): </w:t>
-      </w:r>
-      <w:r>
-        <w:t xml:space="preserve">UserInfo(uuid+@PrePersist)·UserInfoRepository(findByUuid)·UserInfoUserDetails(getUuid, getUsername=email 유지)·UserInfoUserDetailsService(loadUserByUuid)·JwtService·JwtAuthenticationFilter·UserInfoController</w:t>
+        <w:t xml:space="preserve">② 검증 (JwtAuthenticationFilter)</w:t>
+      </w:r>
+    </w:p>
+    <w:p>
+      <w:pPr>
+        <w:pBdr>
+          <w:top w:val="single" w:sz="4" w:space="3" w:color="D9D9D9"/>
+          <w:left w:val="single" w:sz="18" w:space="6" w:color="C0C0C0"/>
+        </w:pBdr>
+        <w:shd w:val="clear" w:color="auto" w:fill="F4F4F4"/>
+      </w:pPr>
+      <w:r>
+        <w:rPr>
+          <w:rFonts w:ascii="Consolas" w:hAnsi="Consolas"/>
+          <w:sz w:val="18"/>
+          <w:szCs w:val="18"/>
+        </w:rPr>
+        <w:t xml:space="preserve">// Before</w:t>
+      </w:r>
+    </w:p>
+    <w:p>
+      <w:pPr>
+        <w:pBdr>
+          <w:left w:val="single" w:sz="18" w:space="6" w:color="C0C0C0"/>
+        </w:pBdr>
+        <w:shd w:val="clear" w:color="auto" w:fill="F4F4F4"/>
+      </w:pPr>
+      <w:r>
+        <w:rPr>
+          <w:rFonts w:ascii="Consolas" w:hAnsi="Consolas"/>
+          <w:sz w:val="18"/>
+          <w:szCs w:val="18"/>
+        </w:rPr>
+        <w:t xml:space="preserve">String username = jwtService.extractUsername(token);</w:t>
+      </w:r>
+    </w:p>
+    <w:p>
+      <w:pPr>
+        <w:pBdr>
+          <w:left w:val="single" w:sz="18" w:space="6" w:color="C0C0C0"/>
+        </w:pBdr>
+        <w:shd w:val="clear" w:color="auto" w:fill="F4F4F4"/>
+      </w:pPr>
+      <w:r>
+        <w:rPr>
+          <w:rFonts w:ascii="Consolas" w:hAnsi="Consolas"/>
+          <w:sz w:val="18"/>
+          <w:szCs w:val="18"/>
+        </w:rPr>
+        <w:t xml:space="preserve">UserDetails ud = userDetailsService.loadUserByUsername(username);    // email 로 조회</w:t>
+      </w:r>
+    </w:p>
+    <w:p>
+      <w:pPr>
+        <w:pBdr>
+          <w:left w:val="single" w:sz="18" w:space="6" w:color="C0C0C0"/>
+        </w:pBdr>
+        <w:shd w:val="clear" w:color="auto" w:fill="F4F4F4"/>
+      </w:pPr>
+      <w:r>
+        <w:rPr>
+          <w:rFonts w:ascii="Consolas" w:hAnsi="Consolas"/>
+          <w:sz w:val="18"/>
+          <w:szCs w:val="18"/>
+        </w:rPr>
+        <w:t xml:space="preserve">// After</w:t>
+      </w:r>
+    </w:p>
+    <w:p>
+      <w:pPr>
+        <w:pBdr>
+          <w:left w:val="single" w:sz="18" w:space="6" w:color="C0C0C0"/>
+        </w:pBdr>
+        <w:shd w:val="clear" w:color="auto" w:fill="F4F4F4"/>
+      </w:pPr>
+      <w:r>
+        <w:rPr>
+          <w:rFonts w:ascii="Consolas" w:hAnsi="Consolas"/>
+          <w:sz w:val="18"/>
+          <w:szCs w:val="18"/>
+        </w:rPr>
+        <w:t xml:space="preserve">String uuid = jwtService.extractSubject(token);</w:t>
+      </w:r>
+    </w:p>
+    <w:p>
+      <w:pPr>
+        <w:pBdr>
+          <w:left w:val="single" w:sz="18" w:space="6" w:color="C0C0C0"/>
+          <w:bottom w:val="single" w:sz="4" w:space="3" w:color="D9D9D9"/>
+        </w:pBdr>
+        <w:shd w:val="clear" w:color="auto" w:fill="F4F4F4"/>
+      </w:pPr>
+      <w:r>
+        <w:rPr>
+          <w:rFonts w:ascii="Consolas" w:hAnsi="Consolas"/>
+          <w:sz w:val="18"/>
+          <w:szCs w:val="18"/>
+        </w:rPr>
+        <w:t xml:space="preserve">UserInfoUserDetails ud = userDetailsService.loadUserByUuid(uuid);    // uuid 로 조회</w:t>
       </w:r>
     </w:p>
     <w:p>
@@ -2268,7 +2899,7 @@
         <w:t xml:space="preserve">검증 결과</w:t>
       </w:r>
       <w:r>
-        <w:t xml:space="preserve"> (검증됨)</w:t>
+        <w:t xml:space="preserve"> (test 프로파일, 검증됨)</w:t>
       </w:r>
     </w:p>
     <w:tbl>

</xml_diff>

<commit_message>
[Docs] JWT 문서: FAQ(alg:none·git secret·fail-closed·secret 길이·PII) 추가 + 페이지 분리
- 8. 자주 묻는 질문(FAQ) 섹션 추가: 학생 반복 질문 5개 정리(md 6. FAQ).
- docx: 제목(표지)·목차·본문을 '줄바꿈' 대신 페이지 나누기(w:br type=page)로 분리.
- 목차에 FAQ 항목 반영. md·docx 동일.
</commit_message>
<xml_diff>
--- a/docs/security/06_JWT_Security.docx
+++ b/docs/security/06_JWT_Security.docx
@@ -58,7 +58,11 @@
         <w:t xml:space="preserve">실습 프로젝트 : Student_JWT (feature/jwt-security-demo)</w:t>
       </w:r>
     </w:p>
-    <w:p/>
+    <w:p>
+      <w:r>
+        <w:br w:type="page"/>
+      </w:r>
+    </w:p>
     <w:p>
       <w:pPr>
         <w:pStyle w:val="1"/>
@@ -164,7 +168,24 @@
         <w:t xml:space="preserve">7. 핵심 요약</w:t>
       </w:r>
     </w:p>
-    <w:p/>
+    <w:p>
+      <w:pPr>
+        <w:pStyle w:val="a4"/>
+        <w:numPr>
+          <w:ilvl w:val="0"/>
+          <w:numId w:val="1"/>
+        </w:numPr>
+        <w:spacing w:after="50" w:line="264" w:lineRule="auto"/>
+      </w:pPr>
+      <w:r>
+        <w:t xml:space="preserve">8. 자주 묻는 질문 (FAQ)</w:t>
+      </w:r>
+    </w:p>
+    <w:p>
+      <w:r>
+        <w:br w:type="page"/>
+      </w:r>
+    </w:p>
     <w:p>
       <w:pPr>
         <w:pStyle w:val="1"/>
@@ -3626,6 +3647,130 @@
       </w:pPr>
       <w:r>
         <w:t xml:space="preserve">탈취 대비는 짧은 만료 + Refresh, 전송은 HTTPS.</w:t>
+      </w:r>
+    </w:p>
+    <w:p>
+      <w:pPr>
+        <w:pStyle w:val="1"/>
+        <w:spacing w:before="320" w:after="160"/>
+      </w:pPr>
+      <w:r>
+        <w:rPr>
+          <w:b/>
+          <w:bCs/>
+          <w:color w:val="1F3864"/>
+        </w:rPr>
+        <w:t xml:space="preserve">8. 자주 묻는 질문 (FAQ)</w:t>
+      </w:r>
+    </w:p>
+    <w:p>
+      <w:pPr>
+        <w:pStyle w:val="3"/>
+        <w:spacing w:before="200" w:after="80"/>
+      </w:pPr>
+      <w:r>
+        <w:rPr>
+          <w:b/>
+          <w:bCs/>
+          <w:color w:val="2E5496"/>
+        </w:rPr>
+        <w:t xml:space="preserve">Q1. alg:none 은 "알고리즘을 쓰지 않는다"는 뜻인가요?</w:t>
+      </w:r>
+    </w:p>
+    <w:p>
+      <w:pPr>
+        <w:spacing w:after="80" w:line="272" w:lineRule="auto"/>
+      </w:pPr>
+      <w:r>
+        <w:t xml:space="preserve">네 — 서명이 없는 토큰이다. 과거 일부 라이브러리가 헤더의 alg 를 그대로 믿어, alg 를 none 으로 바꾸고 서명을 지운 토큰을 검증 없이 통과시켰다(인증 우회). 이 앱은 verifyWith(key) 로 서명을 반드시 요구하므로 alg:none·서명 변조를 거부한다(401). alg 는 공격자가 바꿀 수 있는 값이므로 믿지 말고, 서버가 기대하는 키·알고리즘으로만 검증한다.</w:t>
+      </w:r>
+    </w:p>
+    <w:p>
+      <w:pPr>
+        <w:pStyle w:val="3"/>
+        <w:spacing w:before="200" w:after="80"/>
+      </w:pPr>
+      <w:r>
+        <w:rPr>
+          <w:b/>
+          <w:bCs/>
+          <w:color w:val="2E5496"/>
+        </w:rPr>
+        <w:t xml:space="preserve">Q2. 설정파일의 jwt.secret 이 git 에 올라가 있으면 괜찮은가요?</w:t>
+      </w:r>
+    </w:p>
+    <w:p>
+      <w:pPr>
+        <w:spacing w:after="80" w:line="272" w:lineRule="auto"/>
+      </w:pPr>
+      <w:r>
+        <w:t xml:space="preserve">원칙상 문제다. secret 이 저장소에 있으면(특히 public) 누구나 관리자 토큰을 위조할 수 있다. 다만 이 앱 값은 환경변수 override 를 전제로 한 데모용 기본값이고 보호할 실데이터가 없어 실습에서만 허용한다. 운영이면 치명적 취약점이다. 한 번 커밋한 secret 은 git history 에 영구히 남으므로, 파일에서 지우는 것만으론 부족하고 반드시 새 값으로 교체(로테이션)해야 한다.</w:t>
+      </w:r>
+    </w:p>
+    <w:p>
+      <w:pPr>
+        <w:pStyle w:val="3"/>
+        <w:spacing w:before="200" w:after="80"/>
+      </w:pPr>
+      <w:r>
+        <w:rPr>
+          <w:b/>
+          <w:bCs/>
+          <w:color w:val="2E5496"/>
+        </w:rPr>
+        <w:t xml:space="preserve">Q3. jwt.allow-insecure-secret=false 는 무슨 뜻인가요?</w:t>
+      </w:r>
+    </w:p>
+    <w:p>
+      <w:pPr>
+        <w:spacing w:after="80" w:line="272" w:lineRule="auto"/>
+      </w:pPr>
+      <w:r>
+        <w:t xml:space="preserve">약한/기본 secret 이면 앱 기동을 거부(fail-closed)한다는 뜻이다. 단 false 만으론 부족하고, 강한 JWT_SECRET 을 환경변수로 주입하는 것과 쌍으로 설정해야 실제로 안전하다. (false 로 두고 강한 secret 을 안 주면, 기본값이 약해서 기동이 실패한다 — 의도된 안전 동작이다.)</w:t>
+      </w:r>
+    </w:p>
+    <w:p>
+      <w:pPr>
+        <w:pStyle w:val="3"/>
+        <w:spacing w:before="200" w:after="80"/>
+      </w:pPr>
+      <w:r>
+        <w:rPr>
+          <w:b/>
+          <w:bCs/>
+          <w:color w:val="2E5496"/>
+        </w:rPr>
+        <w:t xml:space="preserve">Q4. 약한/강한 secret 은 byte 수(길이)를 말하나요?</w:t>
+      </w:r>
+    </w:p>
+    <w:p>
+      <w:pPr>
+        <w:spacing w:after="80" w:line="272" w:lineRule="auto"/>
+      </w:pPr>
+      <w:r>
+        <w:t xml:space="preserve">길이는 최소 조건일 뿐이다(HS256 ≥ 32byte = 256bit). 강함 = 길이 + 무작위(엔트로피) + 비밀 유지, 세 가지가 모두 필요하다. 길어도 예측 가능하거나 공개되면 약하다 — 이 앱의 64byte 기본값이 '길지만 공개되어 약한' 예다. 강한 secret 은 사람이 타이핑하지 말고 무작위로 생성한다(예: openssl rand -base64 48).</w:t>
+      </w:r>
+    </w:p>
+    <w:p>
+      <w:pPr>
+        <w:pStyle w:val="3"/>
+        <w:spacing w:before="200" w:after="80"/>
+      </w:pPr>
+      <w:r>
+        <w:rPr>
+          <w:b/>
+          <w:bCs/>
+          <w:color w:val="2E5496"/>
+        </w:rPr>
+        <w:t xml:space="preserve">Q5. PII 가 무엇인가요?</w:t>
+      </w:r>
+    </w:p>
+    <w:p>
+      <w:pPr>
+        <w:spacing w:after="80" w:line="272" w:lineRule="auto"/>
+      </w:pPr>
+      <w:r>
+        <w:t xml:space="preserve">개인 식별 정보(Personally Identifiable Information) — 이름·주민번호·email·전화번호처럼 개인을 알아볼 수 있는 정보다. JWT payload 는 암호화가 아니라 base64 라 누구나 읽을 수 있으므로 PII 를 넣지 않는다. 그래서 이 앱은 토큰 subject 를 email → uuid(불투명 식별자)로 바꿨다(5-2 참고).</w:t>
       </w:r>
     </w:p>
     <w:sectPr>

</xml_diff>

<commit_message>
[Docs] 06_JWT_Security.docx: '4. 공격 실습' 앞에 페이지 나누기 추가
- 수동 줄바꿈 대신 정식 페이지 나누기(w:br type=page)로 4장을 새 페이지에서 시작.
</commit_message>
<xml_diff>
--- a/docs/security/06_JWT_Security.docx
+++ b/docs/security/06_JWT_Security.docx
@@ -953,6 +953,11 @@
           <w:szCs w:val="18"/>
         </w:rPr>
         <w:t xml:space="preserve">Jwts.parser().verifyWith(key).build().parseSignedClaims(token).getPayload();</w:t>
+      </w:r>
+    </w:p>
+    <w:p>
+      <w:r>
+        <w:br w:type="page"/>
       </w:r>
     </w:p>
     <w:p>

</xml_diff>

<commit_message>
[JWT 1단계] FAQ에 'KNOWN_WEAK_SECRETS vs 새 secret' Q&A 추가
jwt.secret을 UUID 생성기로 만든 값으로 바꿀 때 KNOWN_WEAK_SECRETS도
같이 갱신해야 하는지에 대한 질문을 Q6으로 정리. KNOWN_WEAK_SECRETS는
허용 목록이 아니라 블록리스트라 불필요하다는 점과, 웹 생성기 대신
로컬에서 openssl로 생성해 커밋하지 않고 JWT_SECRET 환경변수로만
주입하는 절차(1단계 데모를 건드리지 않고 5-1 안전 버전만 시연하는 법)를 포함.
</commit_message>
<xml_diff>
--- a/docs/security/06_JWT_Security.docx
+++ b/docs/security/06_JWT_Security.docx
@@ -11274,6 +11274,105 @@
       </w:r>
       <w:r>
         <w:t>.</w:t>
+      </w:r>
+    </w:p>
+    <w:p>
+      <w:pPr>
+        <w:spacing w:before="160" w:after="80"/>
+      </w:pPr>
+      <w:r>
+        <w:rPr>
+          <w:b/>
+          <w:bCs/>
+          <w:color w:val="2E5496"/>
+        </w:rPr>
+        <w:t xml:space="preserve">Q6. UUID 생성기 사이트에서 만든 값으로 jwt.secret 을 바꾸면, KNOWN_WEAK_SECRETS 도 같이 바꾿야 하나요?</w:t>
+      </w:r>
+    </w:p>
+    <w:p>
+      <w:pPr>
+        <w:spacing w:after="80" w:line="272" w:lineRule="auto"/>
+      </w:pPr>
+      <w:r>
+        <w:t xml:space="preserve">아니요. KNOWN_WEAK_SECRETS 는 허용 목록이 아니라 이 저장소의 공개 기본값·secret·changeit 같은 흔한 샘플값만 알려진 값을 차단하는 블록리스트다. 새 값이 이 목록에 없고 32바이트 이상이면 validateSecret() 을 그대로 통과하므로, 임의로 만든 값을 매번 이 목록에 추가할 필요는 없다.</w:t>
+      </w:r>
+    </w:p>
+    <w:p>
+      <w:pPr>
+        <w:spacing w:after="80" w:line="272" w:lineRule="auto"/>
+      </w:pPr>
+      <w:r>
+        <w:t xml:space="preserve">다만 UUID 생성기 웹사이트 사용 자체는 권장하지 않는다 — UUIDv4 의 실제 무작위성은 약 122비트로 권장 수준(256비트)보다 약하고, 제3자 사이트가 생성한 값은 전송·로깅 여부를 확인할 수 없어 신뢰하기 어렵다. 어디에든(채팅·문서 등) 붙여넣은 값은 더 이상 비밀이 아니다(Q2 참고).</w:t>
+      </w:r>
+    </w:p>
+    <w:p>
+      <w:pPr>
+        <w:spacing w:after="80" w:line="272" w:lineRule="auto"/>
+      </w:pPr>
+      <w:r>
+        <w:rPr>
+          <w:i/>
+          <w:iCs/>
+        </w:rPr>
+        <w:t xml:space="preserve">실습 안내: 1단계 공격 실습이 목적이면 기본 secret 을 그대로 두고(의도된 상태), "강한 secret 이면 위조가 막힌다"(4-1 안전 버전)를 시연하고 싶을 때만 아래처럼 환경변수로만 주입한다(소스에 커밋하지 않음):</w:t>
+      </w:r>
+    </w:p>
+    <w:p>
+      <w:pPr>
+        <w:pBdr>
+          <w:top w:val="single" w:sz="4" w:space="3" w:color="D9D9D9"/>
+          <w:left w:val="single" w:sz="18" w:space="6" w:color="C0C0C0"/>
+        </w:pBdr>
+        <w:shd w:val="clear" w:color="auto" w:fill="F4F4F4"/>
+      </w:pPr>
+      <w:r>
+        <w:rPr>
+          <w:rFonts w:ascii="Consolas" w:hAnsi="Consolas"/>
+          <w:sz w:val="18"/>
+          <w:szCs w:val="18"/>
+        </w:rPr>
+        <w:t xml:space="preserve">openssl rand -base64 48                               # 로컬에서 강한 secret 생성</w:t>
+      </w:r>
+    </w:p>
+    <w:p>
+      <w:pPr>
+        <w:pBdr>
+          <w:left w:val="single" w:sz="18" w:space="6" w:color="C0C0C0"/>
+        </w:pBdr>
+        <w:shd w:val="clear" w:color="auto" w:fill="F4F4F4"/>
+      </w:pPr>
+      <w:r>
+        <w:rPr>
+          <w:rFonts w:ascii="Consolas" w:hAnsi="Consolas"/>
+          <w:sz w:val="18"/>
+          <w:szCs w:val="18"/>
+        </w:rPr>
+        <w:t xml:space="preserve">$env:JWT_SECRET = "&lt;생성한 값&gt;"                       # 커밋 X, 이 세션에만 적용</w:t>
+      </w:r>
+    </w:p>
+    <w:p>
+      <w:pPr>
+        <w:pBdr>
+          <w:left w:val="single" w:sz="18" w:space="6" w:color="C0C0C0"/>
+          <w:bottom w:val="single" w:sz="4" w:space="3" w:color="D9D9D9"/>
+        </w:pBdr>
+        <w:shd w:val="clear" w:color="auto" w:fill="F4F4F4"/>
+      </w:pPr>
+      <w:r>
+        <w:rPr>
+          <w:rFonts w:ascii="Consolas" w:hAnsi="Consolas"/>
+          <w:sz w:val="18"/>
+          <w:szCs w:val="18"/>
+        </w:rPr>
+        <w:t xml:space="preserve">.\mvnw.cmd spring-boot:run                            # 이제 강한 secret 으로 기동</w:t>
+      </w:r>
+    </w:p>
+    <w:p>
+      <w:pPr>
+        <w:spacing w:after="80" w:line="272" w:lineRule="auto"/>
+      </w:pPr>
+      <w:r>
+        <w:t xml:space="preserve">→ 환경변수를 설정하지 않고 끄면 기본 공개 secret 으로 되돌아가 1단계 공격이 다시 성공한다.</w:t>
       </w:r>
     </w:p>
     <w:sectPr>

</xml_diff>

<commit_message>
[JWT 1단계] FAQ Q6 보강: openssl rand -base64 48 의미 + 셸별(PowerShell/cmd.exe/Git Bash) 환경변수 주입 문법
48이 시드가 아니라 '생성할 원본 바이트 수'라는 점과, openssl rand가
매번 OS CSPRNG에서 새 엔트로피를 가져와 재현 불가능한 값을 만든다는
점을 설명. cmd.exe의 `set "NAME=VALUE"` 문법(= 양옆 공백 금지)을
표로 추가해 PowerShell 전용이던 기존 안내를 셸별로 확장.
</commit_message>
<xml_diff>
--- a/docs/security/06_JWT_Security.docx
+++ b/docs/security/06_JWT_Security.docx
@@ -11319,6 +11319,214 @@
     </w:p>
     <w:p>
       <w:pPr>
+        <w:spacing w:after="80" w:line="272" w:lineRule="auto"/>
+      </w:pPr>
+      <w:r>
+        <w:t xml:space="preserve">① openssl rand -base64 48 의 의미 — 48 은 시드(seed)가 아니라 "생성할 원본 바이트 수"다. 실행할 때마다 OS 의 CSPRNG(암호학적 난수 생성기)에서 새 엔트로피를 가져와 매번 다른 값이 나온다(재현 불가능해야 비밀로서 의미가 있다). 48바이트 = 384비트 엔트로피(최소 권장 256비트보다 넣넓함)이고, -base64 는 그 원본 바이트를 복사·붙여넣기 가능한 문자열로 인코딩할 뿐이다(3바이트 → 4글자이므로 결과는 64자).</w:t>
+      </w:r>
+    </w:p>
+    <w:tbl>
+      <w:tblPr>
+        <w:tblW w:w="9000" w:type="dxa"/>
+        <w:tblBorders>
+          <w:top w:val="single" w:sz="4" w:space="0" w:color="BFBFBF"/>
+          <w:left w:val="single" w:sz="4" w:space="0" w:color="BFBFBF"/>
+          <w:bottom w:val="single" w:sz="4" w:space="0" w:color="BFBFBF"/>
+          <w:right w:val="single" w:sz="4" w:space="0" w:color="BFBFBF"/>
+          <w:insideH w:val="single" w:sz="4" w:space="0" w:color="BFBFBF"/>
+          <w:insideV w:val="single" w:sz="4" w:space="0" w:color="BFBFBF"/>
+        </w:tblBorders>
+        <w:tblLook w:val="04A0" w:firstRow="1" w:lastRow="0" w:firstColumn="1" w:lastColumn="0" w:noHBand="0" w:noVBand="1"/>
+      </w:tblPr>
+      <w:tblGrid>
+        <w:gridCol w:w="1800"/>
+        <w:gridCol w:w="7200"/>
+      </w:tblGrid>
+      <w:tr>
+        <w:trPr>
+          <w:tblHeader/>
+        </w:trPr>
+        <w:tc>
+          <w:tcPr>
+            <w:tcW w:w="1800" w:type="dxa"/>
+            <w:shd w:val="clear" w:color="auto" w:fill="2E5496"/>
+            <w:tcMar>
+              <w:top w:w="40" w:type="dxa"/>
+              <w:left w:w="80" w:type="dxa"/>
+              <w:bottom w:w="40" w:type="dxa"/>
+              <w:right w:w="80" w:type="dxa"/>
+            </w:tcMar>
+          </w:tcPr>
+          <w:p>
+            <w:r>
+              <w:rPr>
+                <w:b/>
+                <w:bCs/>
+                <w:color w:val="FFFFFF"/>
+                <w:sz w:val="18"/>
+                <w:szCs w:val="18"/>
+              </w:rPr>
+              <w:t xml:space="preserve">션</w:t>
+            </w:r>
+          </w:p>
+        </w:tc>
+        <w:tc>
+          <w:tcPr>
+            <w:tcW w:w="7200" w:type="dxa"/>
+            <w:shd w:val="clear" w:color="auto" w:fill="2E5496"/>
+            <w:tcMar>
+              <w:top w:w="40" w:type="dxa"/>
+              <w:left w:w="80" w:type="dxa"/>
+              <w:bottom w:w="40" w:type="dxa"/>
+              <w:right w:w="80" w:type="dxa"/>
+            </w:tcMar>
+          </w:tcPr>
+          <w:p>
+            <w:r>
+              <w:rPr>
+                <w:b/>
+                <w:bCs/>
+                <w:color w:val="FFFFFF"/>
+                <w:sz w:val="18"/>
+                <w:szCs w:val="18"/>
+              </w:rPr>
+              <w:t xml:space="preserve">명령</w:t>
+            </w:r>
+          </w:p>
+        </w:tc>
+      </w:tr>
+      <w:tr>
+        <w:tc>
+          <w:tcPr>
+            <w:tcW w:w="1800" w:type="dxa"/>
+            <w:tcMar>
+              <w:top w:w="40" w:type="dxa"/>
+              <w:left w:w="80" w:type="dxa"/>
+              <w:bottom w:w="40" w:type="dxa"/>
+              <w:right w:w="80" w:type="dxa"/>
+            </w:tcMar>
+          </w:tcPr>
+          <w:p>
+            <w:r>
+              <w:rPr>
+                <w:sz w:val="18"/>
+                <w:szCs w:val="18"/>
+              </w:rPr>
+              <w:t xml:space="preserve">PowerShell</w:t>
+            </w:r>
+          </w:p>
+        </w:tc>
+        <w:tc>
+          <w:tcPr>
+            <w:tcW w:w="7200" w:type="dxa"/>
+            <w:tcMar>
+              <w:top w:w="40" w:type="dxa"/>
+              <w:left w:w="80" w:type="dxa"/>
+              <w:bottom w:w="40" w:type="dxa"/>
+              <w:right w:w="80" w:type="dxa"/>
+            </w:tcMar>
+          </w:tcPr>
+          <w:p>
+            <w:r>
+              <w:rPr>
+                <w:rFonts w:ascii="Consolas" w:hAnsi="Consolas"/>
+                <w:sz w:val="18"/>
+                <w:szCs w:val="18"/>
+              </w:rPr>
+              <w:t xml:space="preserve">$env:JWT_SECRET = "&lt;생성한 값&gt;"</w:t>
+            </w:r>
+          </w:p>
+        </w:tc>
+      </w:tr>
+      <w:tr>
+        <w:tc>
+          <w:tcPr>
+            <w:tcW w:w="1800" w:type="dxa"/>
+            <w:tcMar>
+              <w:top w:w="40" w:type="dxa"/>
+              <w:left w:w="80" w:type="dxa"/>
+              <w:bottom w:w="40" w:type="dxa"/>
+              <w:right w:w="80" w:type="dxa"/>
+            </w:tcMar>
+          </w:tcPr>
+          <w:p>
+            <w:r>
+              <w:rPr>
+                <w:sz w:val="18"/>
+                <w:szCs w:val="18"/>
+              </w:rPr>
+              <w:t xml:space="preserve">cmd.exe</w:t>
+            </w:r>
+          </w:p>
+        </w:tc>
+        <w:tc>
+          <w:tcPr>
+            <w:tcW w:w="7200" w:type="dxa"/>
+            <w:tcMar>
+              <w:top w:w="40" w:type="dxa"/>
+              <w:left w:w="80" w:type="dxa"/>
+              <w:bottom w:w="40" w:type="dxa"/>
+              <w:right w:w="80" w:type="dxa"/>
+            </w:tcMar>
+          </w:tcPr>
+          <w:p>
+            <w:r>
+              <w:rPr>
+                <w:rFonts w:ascii="Consolas" w:hAnsi="Consolas"/>
+                <w:sz w:val="18"/>
+                <w:szCs w:val="18"/>
+              </w:rPr>
+              <w:t xml:space="preserve">set "JWT_SECRET=&lt;생성한 값&gt;"  (⚠ = 양엽 공백 금지, 이름=값 전체를 따옴표로)</w:t>
+            </w:r>
+          </w:p>
+        </w:tc>
+      </w:tr>
+      <w:tr>
+        <w:tc>
+          <w:tcPr>
+            <w:tcW w:w="1800" w:type="dxa"/>
+            <w:tcMar>
+              <w:top w:w="40" w:type="dxa"/>
+              <w:left w:w="80" w:type="dxa"/>
+              <w:bottom w:w="40" w:type="dxa"/>
+              <w:right w:w="80" w:type="dxa"/>
+            </w:tcMar>
+          </w:tcPr>
+          <w:p>
+            <w:r>
+              <w:rPr>
+                <w:sz w:val="18"/>
+                <w:szCs w:val="18"/>
+              </w:rPr>
+              <w:t xml:space="preserve">Git Bash</w:t>
+            </w:r>
+          </w:p>
+        </w:tc>
+        <w:tc>
+          <w:tcPr>
+            <w:tcW w:w="7200" w:type="dxa"/>
+            <w:tcMar>
+              <w:top w:w="40" w:type="dxa"/>
+              <w:left w:w="80" w:type="dxa"/>
+              <w:bottom w:w="40" w:type="dxa"/>
+              <w:right w:w="80" w:type="dxa"/>
+            </w:tcMar>
+          </w:tcPr>
+          <w:p>
+            <w:r>
+              <w:rPr>
+                <w:rFonts w:ascii="Consolas" w:hAnsi="Consolas"/>
+                <w:sz w:val="18"/>
+                <w:szCs w:val="18"/>
+              </w:rPr>
+              <w:t xml:space="preserve">JWT_SECRET="&lt;생성한 값&gt;" ./mvnw.cmd spring-boot:run</w:t>
+            </w:r>
+          </w:p>
+        </w:tc>
+      </w:tr>
+    </w:tbl>
+    <w:p>
+      <w:pPr>
         <w:pBdr>
           <w:top w:val="single" w:sz="4" w:space="3" w:color="D9D9D9"/>
           <w:left w:val="single" w:sz="18" w:space="6" w:color="C0C0C0"/>
@@ -11331,7 +11539,7 @@
           <w:sz w:val="18"/>
           <w:szCs w:val="18"/>
         </w:rPr>
-        <w:t xml:space="preserve">openssl rand -base64 48                               # 로컬에서 강한 secret 생성</w:t>
+        <w:t xml:space="preserve">openssl rand -base64 48                               # 로컬에서 강한 secret 생성 (매번 다른 값)</w:t>
       </w:r>
     </w:p>
     <w:p>
@@ -11347,7 +11555,7 @@
           <w:sz w:val="18"/>
           <w:szCs w:val="18"/>
         </w:rPr>
-        <w:t xml:space="preserve">$env:JWT_SECRET = "&lt;생성한 값&gt;"                       # 커밋 X, 이 세션에만 적용</w:t>
+        <w:t xml:space="preserve">$env:JWT_SECRET = "&lt;생성한 값&gt;"                       # PowerShell 예시. cmd.exe/Git Bash 는 위 표 참고</w:t>
       </w:r>
     </w:p>
     <w:p>
@@ -11364,7 +11572,7 @@
           <w:sz w:val="18"/>
           <w:szCs w:val="18"/>
         </w:rPr>
-        <w:t xml:space="preserve">.\mvnw.cmd spring-boot:run                            # 이제 강한 secret 으로 기동</w:t>
+        <w:t xml:space="preserve">.\mvnw.cmd spring-boot:run                            # cmd.exe 라면 .\ 없이 mvnw.cmd spring-boot:run</w:t>
       </w:r>
     </w:p>
     <w:p>
@@ -11372,7 +11580,7 @@
         <w:spacing w:after="80" w:line="272" w:lineRule="auto"/>
       </w:pPr>
       <w:r>
-        <w:t xml:space="preserve">→ 환경변수를 설정하지 않고 끄면 기본 공개 secret 으로 되돌아가 1단계 공격이 다시 성공한다.</w:t>
+        <w:t xml:space="preserve">→ 환경변수를 설정하지 않고 끄면 기본 공개 secret 으로 되돌아가 1단계 공격이 다시 성공한다. 이 환경변수는 그 세션에만 적용되고 커밋되지 않으므로 데모 전환용으로 안전하다.</w:t>
       </w:r>
     </w:p>
     <w:sectPr>

</xml_diff>

<commit_message>
[JWT 1단계] FAQ Q4 보강: KNOWN_WEAK_SECRETS 연출 의도 + '모름'을 줄이는 대책
KNOWN_WEAK_SECRETS 에 등록된 53... 값이 실제 유출 사고가 아니라
"이미 노출된 secret" 상황을 교육용으로 연출한 값임을 명시. 이어서
이 블록리스트가 실시간 유출 감지기가 아니라는 점(담당자가 직접 만든
새 secret 이 나중에 유출돼도 코드가 자동으로 막아주지 않음)과, 그
"모름"을 줄이기 위한 실질적 장치(커밋 전 시크릿 스캐너·정기
로테이션·비정상 사용 모니터링·비밀 관리소)를 표로 추가.
docx는 사용자가 수동으로 넣은 페이지 나눔과 jwt.io 캡처 이미지를
그대로 보존한 상태에서 편집.
</commit_message>
<xml_diff>
--- a/docs/security/06_JWT_Security.docx
+++ b/docs/security/06_JWT_Security.docx
@@ -253,7 +253,7 @@
         <w:spacing w:after="50" w:line="264" w:lineRule="auto"/>
       </w:pPr>
       <w:r>
-        <w:t xml:space="preserve">서명 ≠ 암호화 : payload 는 암호화가 아니라 base64 인코딩일 뿐이다. 누구나 디코딩</w:t>
+        <w:t>서명 ≠ 암호화 : payload 는 암호화가 아니라 base64 인코딩일 뿐이다. 누구나 디코딩</w:t>
       </w:r>
       <w:r>
         <w:rPr>
@@ -1083,7 +1083,7 @@
         <w:rPr>
           <w:rFonts w:hint="eastAsia"/>
         </w:rPr>
-        <w:t xml:space="preserve">웹사이트에서 디코딩 할 수 있음</w:t>
+        <w:t>웹사이트에서 디코딩 할 수 있음</w:t>
       </w:r>
     </w:p>
     <w:p>
@@ -1142,7 +1142,7 @@
           <w:bCs/>
           <w:color w:val="2E5496"/>
         </w:rPr>
-        <w:t xml:space="preserve">4-1. Secret 유출 → 토큰 위조 → email 로 role 까지 알아내고 관리자 탈취</w:t>
+        <w:t>4-1. Secret 유출 → 토큰 위조 → email 로 role 까지 알아내고 관리자 탈취</w:t>
       </w:r>
     </w:p>
     <w:p>
@@ -1663,7 +1663,7 @@
         <w:spacing w:after="50" w:line="264" w:lineRule="auto"/>
       </w:pPr>
       <w:r>
-        <w:t xml:space="preserve">header·payload(JSON)를 각각 base64url 로 인코딩해 으로 잇는다 → signing_input</w:t>
+        <w:t>header·payload(JSON)를 각각 base64url 로 인코딩해 으로 잇는다 → signing_input</w:t>
       </w:r>
     </w:p>
     <w:p>
@@ -3217,7 +3217,10 @@
     </w:p>
     <w:p>
       <w:pPr>
-        <w:spacing w:after="80" w:line="272" w:lineRule="auto"/>
+        <w:spacing w:after="80" w:line="276" w:lineRule="auto"/>
+        <w:rPr>
+          <w:rFonts w:hint="eastAsia"/>
+        </w:rPr>
       </w:pPr>
       <w:r>
         <w:t>원칙상 문제다. secret 이 저장소에 있으면(특히 public) 누구나 관리자 토큰을 위조할 수 있다. 다만 이 앱 값은 환경변수 override 를 전제로 한 데모용 기본값이고 보호할 실데이터가 없어 실습에서만 허용한다. 운영이면 치명적 취약점이다. 한 번 커밋한 secret 은 git history 에 영구히 남으므로, 파일에서 지우는 것만으론 부족하고 반드시 새 값으로 교체(로테이션)해야 한다.</w:t>
@@ -3226,51 +3229,341 @@
     <w:p>
       <w:pPr>
         <w:pStyle w:val="3"/>
-        <w:spacing w:before="200" w:after="80"/>
+        <w:spacing w:after="80" w:line="276" w:lineRule="auto"/>
+      </w:pPr>
+      <w:r>
         <w:rPr>
           <w:b/>
           <w:bCs/>
           <w:color w:val="2E5496"/>
         </w:rPr>
-      </w:pPr>
+        <w:t xml:space="preserve">Q3. jwt.allow-insecure-secret=false 는 무슨 뜻인가요?</w:t>
+      </w:r>
+    </w:p>
+    <w:p>
+      <w:pPr>
+        <w:spacing w:after="80" w:line="272" w:lineRule="auto"/>
+      </w:pPr>
+      <w:r>
+        <w:t>약한/기본 secret 이면 앱 기동을 거부(fail-closed)한다는 뜻이다. 단 false 만으론 부족하고, 강한 JWT_SECRET 을 환경변수로 주입하는 것과 쌍으로 설정해야 실제로 안전하다. (false 로 두고 강한 secret 을 안 주면, 기본값이 약해서 기동이 실패한다 — 의도된 안전 동작이다.)</w:t>
+      </w:r>
     </w:p>
     <w:p>
       <w:pPr>
         <w:pStyle w:val="3"/>
         <w:spacing w:before="200" w:after="80"/>
+      </w:pPr>
+      <w:r>
         <w:rPr>
           <w:b/>
           <w:bCs/>
           <w:color w:val="2E5496"/>
         </w:rPr>
-      </w:pPr>
-    </w:p>
-    <w:p>
-      <w:pPr>
-        <w:pStyle w:val="3"/>
-        <w:spacing w:before="200" w:after="80"/>
-      </w:pPr>
-      <w:r>
+        <w:t>Q4. 약한/강한 secret 은 byte 수(길이)를 말하나요?</w:t>
+      </w:r>
+    </w:p>
+    <w:p>
+      <w:pPr>
+        <w:spacing w:after="80" w:line="272" w:lineRule="auto"/>
+      </w:pPr>
+      <w:r>
+        <w:t>길이는 최소 조건일 뿐이다(HS256 ≥ 32byte = 256bit). 강함 = 길이 + 무작위(엔트로피) + 비밀 유지, 세 가지가 모두 필요하다. 길어도 예측 가능하거나 공개되면 약하다 — 이 앱의 64byte 기본값이 '길지만 공개되어 약한' 예다. 강한 secret 은 사람이 타이핑하지 말고 무작위로 생성한다(예: openssl rand -base64 48).</w:t>
+      </w:r>
+    </w:p>
+    <w:p>
+      <w:pPr>
+        <w:spacing w:after="80" w:line="272" w:lineRule="auto"/>
+      </w:pPr>
+      <w:r>
+        <w:rPr>
+          <w:b/>
+          <w:bCs/>
+        </w:rPr>
+        <w:t xml:space="preserve">KNOWN_WEAK_SECRETS 의 5367... 값은 왜 등록돼 있나? </w:t>
+      </w:r>
+      <w:r>
+        <w:t xml:space="preserve">실제 어디선가 유출된 사고가 있었던 게 아니라, "이미 노출된 secret" 상황을 교육용으로 일부러 연출한 값이다. 처음부터 이 공개 저장소의 소스에 커밋해 두어 누구나 알 수 있는 상태로 만든 것 — 그래서 이 값으로 위조 공격이 성공하는 것 자체가 "공개되면(길이·무작위성과 무관하게) 약하다"는 교훈의 시연이다. KNOWN_WEAK_SECRETS 에 정확히 이 문자열이 등록돼 있어, validateSecret() 이 길이 조건(64바이트, 통과)과 무관하게 "알려진 값"이라는 이유만으로 거부한다.</w:t>
+      </w:r>
+    </w:p>
+    <w:p>
+      <w:pPr>
+        <w:spacing w:after="80" w:line="272" w:lineRule="auto"/>
+      </w:pPr>
+      <w:r>
+        <w:t xml:space="preserve">그런데 이 블록리스트는 "실시간 유출 감지기"가 아니다. 미리 등록해 둔 값만 거부하는 고정 목록일 뿐이다. 담당자가 직접 생성한 새 secret 이 나중에(채팅에 붙여넣기·실수로 커밋 등으로) 유출돼도, 그 값은 이 목록에 없으므로 validateSecret() 은 여전히 "강하다"고 판단해 정상 기동한다 — 코드가 그 유출을 알아서 막아주지 않는다. 담당자가 유출 사실 자체를 모르면, 공격자는 정상 서명된 토큰으로 조용히 들어오고 아무 이상 없이 뚚린다.</w:t>
+      </w:r>
+    </w:p>
+    <w:p>
+      <w:pPr>
+        <w:spacing w:after="80" w:line="272" w:lineRule="auto"/>
+      </w:pPr>
+      <w:r>
+        <w:rPr>
+          <w:b/>
+          <w:bCs/>
+        </w:rPr>
+        <w:t xml:space="preserve">"모름"을 줄이기 위한 실질적 장치들</w:t>
+      </w:r>
+      <w:r>
+        <w:t xml:space="preserve"/>
+      </w:r>
+    </w:p>
+    <w:tbl>
+      <w:tblPr>
+        <w:tblW w:w="9000" w:type="dxa"/>
+        <w:tblBorders>
+          <w:top w:val="single" w:sz="4" w:space="0" w:color="BFBFBF"/>
+          <w:left w:val="single" w:sz="4" w:space="0" w:color="BFBFBF"/>
+          <w:bottom w:val="single" w:sz="4" w:space="0" w:color="BFBFBF"/>
+          <w:right w:val="single" w:sz="4" w:space="0" w:color="BFBFBF"/>
+          <w:insideH w:val="single" w:sz="4" w:space="0" w:color="BFBFBF"/>
+          <w:insideV w:val="single" w:sz="4" w:space="0" w:color="BFBFBF"/>
+        </w:tblBorders>
+        <w:tblLook w:val="04A0" w:firstRow="1" w:lastRow="0" w:firstColumn="1" w:lastColumn="0" w:noHBand="0" w:noVBand="1"/>
+      </w:tblPr>
+      <w:tblGrid>
+        <w:gridCol w:w="3600"/>
+        <w:gridCol w:w="5400"/>
+      </w:tblGrid>
+      <w:tr>
+        <w:trPr>
+          <w:tblHeader/>
+        </w:trPr>
+        <w:tc>
+          <w:tcPr>
+            <w:tcW w:w="3600" w:type="dxa"/>
+            <w:shd w:val="clear" w:color="auto" w:fill="2E5496"/>
+            <w:tcMar>
+              <w:top w:w="40" w:type="dxa"/>
+              <w:left w:w="80" w:type="dxa"/>
+              <w:bottom w:w="40" w:type="dxa"/>
+              <w:right w:w="80" w:type="dxa"/>
+            </w:tcMar>
+          </w:tcPr>
+          <w:p>
+            <w:r>
+              <w:rPr>
+                <w:b/>
+                <w:bCs/>
+                <w:color w:val="FFFFFF"/>
+                <w:sz w:val="18"/>
+                <w:szCs w:val="18"/>
+              </w:rPr>
+              <w:t xml:space="preserve">대책</w:t>
+            </w:r>
+          </w:p>
+        </w:tc>
+        <w:tc>
+          <w:tcPr>
+            <w:tcW w:w="5400" w:type="dxa"/>
+            <w:shd w:val="clear" w:color="auto" w:fill="2E5496"/>
+            <w:tcMar>
+              <w:top w:w="40" w:type="dxa"/>
+              <w:left w:w="80" w:type="dxa"/>
+              <w:bottom w:w="40" w:type="dxa"/>
+              <w:right w:w="80" w:type="dxa"/>
+            </w:tcMar>
+          </w:tcPr>
+          <w:p>
+            <w:r>
+              <w:rPr>
+                <w:b/>
+                <w:bCs/>
+                <w:color w:val="FFFFFF"/>
+                <w:sz w:val="18"/>
+                <w:szCs w:val="18"/>
+              </w:rPr>
+              <w:t xml:space="preserve">역할</w:t>
+            </w:r>
+          </w:p>
+        </w:tc>
+      </w:tr>
+      <w:tr>
+        <w:tc>
+          <w:tcPr>
+            <w:tcW w:w="3600" w:type="dxa"/>
+            <w:tcMar>
+              <w:top w:w="40" w:type="dxa"/>
+              <w:left w:w="80" w:type="dxa"/>
+              <w:bottom w:w="40" w:type="dxa"/>
+              <w:right w:w="80" w:type="dxa"/>
+            </w:tcMar>
+          </w:tcPr>
+          <w:p>
+            <w:r>
+              <w:rPr>
+                <w:sz w:val="18"/>
+                <w:szCs w:val="18"/>
+              </w:rPr>
+              <w:t xml:space="preserve">커밋 전 시크릿 스캐너(git-secrets, gitleaks, GitHub Secret Scanning 등)</w:t>
+            </w:r>
+          </w:p>
+        </w:tc>
+        <w:tc>
+          <w:tcPr>
+            <w:tcW w:w="5400" w:type="dxa"/>
+            <w:tcMar>
+              <w:top w:w="40" w:type="dxa"/>
+              <w:left w:w="80" w:type="dxa"/>
+              <w:bottom w:w="40" w:type="dxa"/>
+              <w:right w:w="80" w:type="dxa"/>
+            </w:tcMar>
+          </w:tcPr>
+          <w:p>
+            <w:r>
+              <w:rPr>
+                <w:sz w:val="18"/>
+                <w:szCs w:val="18"/>
+              </w:rPr>
+              <w:t xml:space="preserve">실수로 secret 이 커밋되는 순간(= 유출 시작점)을 기계적으로 잡아냄 — 사람이 모라도 도구가 안다</w:t>
+            </w:r>
+          </w:p>
+        </w:tc>
+      </w:tr>
+      <w:tr>
+        <w:tc>
+          <w:tcPr>
+            <w:tcW w:w="3600" w:type="dxa"/>
+            <w:tcMar>
+              <w:top w:w="40" w:type="dxa"/>
+              <w:left w:w="80" w:type="dxa"/>
+              <w:bottom w:w="40" w:type="dxa"/>
+              <w:right w:w="80" w:type="dxa"/>
+            </w:tcMar>
+          </w:tcPr>
+          <w:p>
+            <w:r>
+              <w:rPr>
+                <w:sz w:val="18"/>
+                <w:szCs w:val="18"/>
+              </w:rPr>
+              <w:t xml:space="preserve">정기 로테이션(일정 주기)</w:t>
+            </w:r>
+          </w:p>
+        </w:tc>
+        <w:tc>
+          <w:tcPr>
+            <w:tcW w:w="5400" w:type="dxa"/>
+            <w:tcMar>
+              <w:top w:w="40" w:type="dxa"/>
+              <w:left w:w="80" w:type="dxa"/>
+              <w:bottom w:w="40" w:type="dxa"/>
+              <w:right w:w="80" w:type="dxa"/>
+            </w:tcMar>
+          </w:tcPr>
+          <w:p>
+            <w:r>
+              <w:rPr>
+                <w:sz w:val="18"/>
+                <w:szCs w:val="18"/>
+              </w:rPr>
+              <w:t xml:space="preserve">유출을 알았을 때만이 아니라 모르고도 주기적으로 교체 → 모르는 유출이 있었더라도 피해 기간을 유한하게 제한</w:t>
+            </w:r>
+          </w:p>
+        </w:tc>
+      </w:tr>
+      <w:tr>
+        <w:tc>
+          <w:tcPr>
+            <w:tcW w:w="3600" w:type="dxa"/>
+            <w:tcMar>
+              <w:top w:w="40" w:type="dxa"/>
+              <w:left w:w="80" w:type="dxa"/>
+              <w:bottom w:w="40" w:type="dxa"/>
+              <w:right w:w="80" w:type="dxa"/>
+            </w:tcMar>
+          </w:tcPr>
+          <w:p>
+            <w:r>
+              <w:rPr>
+                <w:sz w:val="18"/>
+                <w:szCs w:val="18"/>
+              </w:rPr>
+              <w:t xml:space="preserve">비정상 사용 모니터링(평소 안 쓰던 IP·시간대의 admin 로그인, 짧은 시간 반복 호출 등)</w:t>
+            </w:r>
+          </w:p>
+        </w:tc>
+        <w:tc>
+          <w:tcPr>
+            <w:tcW w:w="5400" w:type="dxa"/>
+            <w:tcMar>
+              <w:top w:w="40" w:type="dxa"/>
+              <w:left w:w="80" w:type="dxa"/>
+              <w:bottom w:w="40" w:type="dxa"/>
+              <w:right w:w="80" w:type="dxa"/>
+            </w:tcMar>
+          </w:tcPr>
+          <w:p>
+            <w:r>
+              <w:rPr>
+                <w:sz w:val="18"/>
+                <w:szCs w:val="18"/>
+              </w:rPr>
+              <w:t xml:space="preserve">secret 자체는 못 잡아도 악용 "결과"는 탐지 — 5-3 토큰 무효화·감사 로깅(OWASP #9)과 연결</w:t>
+            </w:r>
+          </w:p>
+        </w:tc>
+      </w:tr>
+      <w:tr>
+        <w:tc>
+          <w:tcPr>
+            <w:tcW w:w="3600" w:type="dxa"/>
+            <w:tcMar>
+              <w:top w:w="40" w:type="dxa"/>
+              <w:left w:w="80" w:type="dxa"/>
+              <w:bottom w:w="40" w:type="dxa"/>
+              <w:right w:w="80" w:type="dxa"/>
+            </w:tcMar>
+          </w:tcPr>
+          <w:p>
+            <w:r>
+              <w:rPr>
+                <w:sz w:val="18"/>
+                <w:szCs w:val="18"/>
+              </w:rPr>
+              <w:t xml:space="preserve">비밀 관리소(Vault, AWS/Azure Secrets Manager 등)</w:t>
+            </w:r>
+          </w:p>
+        </w:tc>
+        <w:tc>
+          <w:tcPr>
+            <w:tcW w:w="5400" w:type="dxa"/>
+            <w:tcMar>
+              <w:top w:w="40" w:type="dxa"/>
+              <w:left w:w="80" w:type="dxa"/>
+              <w:bottom w:w="40" w:type="dxa"/>
+              <w:right w:w="80" w:type="dxa"/>
+            </w:tcMar>
+          </w:tcPr>
+          <w:p>
+            <w:r>
+              <w:rPr>
+                <w:sz w:val="18"/>
+                <w:szCs w:val="18"/>
+              </w:rPr>
+              <w:t xml:space="preserve">사람이 환경변수를 직접 복붙하지 않게 해, 실수로 어디선가 붙여넣는 경로 자체를 줄임</w:t>
+            </w:r>
+          </w:p>
+        </w:tc>
+      </w:tr>
+    </w:tbl>
+    <w:p>
+      <w:pPr>
+        <w:spacing w:after="80" w:line="272" w:lineRule="auto"/>
+      </w:pPr>
+      <w:r>
+        <w:t xml:space="preserve">즉 "유출을 담당자가 알아야만 안전하다"는 구조 자체가 취약하므로, 사람이 모라도 자동으로 잡거나(스캐너), 모라도 피해가 제한되게(정기 로테이션·모니터링) 설계하는 것이 핵심이다.</w:t>
+      </w:r>
+    </w:p>
+    <w:p>
+      <w:pPr>
         <w:rPr>
           <w:b/>
           <w:bCs/>
           <w:color w:val="2E5496"/>
-        </w:rPr>
-        <w:t xml:space="preserve">Q3. jwt.allow-insecure-secret=false 는 무슨 뜻인가요?</w:t>
-      </w:r>
-    </w:p>
-    <w:p>
-      <w:pPr>
-        <w:spacing w:after="80" w:line="272" w:lineRule="auto"/>
-      </w:pPr>
-      <w:r>
-        <w:t>약한/기본 secret 이면 앱 기동을 거부(fail-closed)한다는 뜻이다. 단 false 만으론 부족하고, 강한 JWT_SECRET 을 환경변수로 주입하는 것과 쌍으로 설정해야 실제로 안전하다. (false 로 두고 강한 secret 을 안 주면, 기본값이 약해서 기동이 실패한다 — 의도된 안전 동작이다.)</w:t>
-      </w:r>
-    </w:p>
-    <w:p>
-      <w:pPr>
-        <w:pStyle w:val="3"/>
-        <w:spacing w:before="200" w:after="80"/>
+          <w:sz w:val="24"/>
+          <w:szCs w:val="24"/>
+        </w:rPr>
       </w:pPr>
       <w:r>
         <w:rPr>
@@ -3278,21 +3571,18 @@
           <w:bCs/>
           <w:color w:val="2E5496"/>
         </w:rPr>
-        <w:t>Q4. 약한/강한 secret 은 byte 수(길이)를 말하나요?</w:t>
-      </w:r>
-    </w:p>
-    <w:p>
-      <w:pPr>
-        <w:spacing w:after="80" w:line="272" w:lineRule="auto"/>
-      </w:pPr>
-      <w:r>
-        <w:t>길이는 최소 조건일 뿐이다(HS256 ≥ 32byte = 256bit). 강함 = 길이 + 무작위(엔트로피) + 비밀 유지, 세 가지가 모두 필요하다. 길어도 예측 가능하거나 공개되면 약하다 — 이 앱의 64byte 기본값이 '길지만 공개되어 약한' 예다. 강한 secret 은 사람이 타이핑하지 말고 무작위로 생성한다(예: openssl rand -base64 48).</w:t>
-      </w:r>
-    </w:p>
-    <w:p>
-      <w:pPr>
-        <w:pStyle w:val="3"/>
-        <w:spacing w:before="200" w:after="80"/>
+        <w:br w:type="page"/>
+      </w:r>
+    </w:p>
+    <w:p>
+      <w:pPr>
+        <w:rPr>
+          <w:b/>
+          <w:bCs/>
+          <w:color w:val="2E5496"/>
+          <w:sz w:val="24"/>
+          <w:szCs w:val="24"/>
+        </w:rPr>
       </w:pPr>
       <w:r>
         <w:rPr>
@@ -3576,7 +3866,6 @@
             </w:tcMar>
           </w:tcPr>
           <w:p>
-            <w:bookmarkStart w:id="0" w:name="_GoBack"/>
             <w:r>
               <w:rPr>
                 <w:rFonts w:ascii="Consolas" w:hAnsi="Consolas"/>
@@ -3585,7 +3874,6 @@
               </w:rPr>
               <w:t xml:space="preserve">JWT_SECRET="&lt;생성한 값&gt;" ./mvnw.cmd spring-boot:run</w:t>
             </w:r>
-            <w:bookmarkEnd w:id="0"/>
           </w:p>
         </w:tc>
       </w:tr>
@@ -3598,13 +3886,23 @@
         </w:pBdr>
         <w:shd w:val="clear" w:color="auto" w:fill="F4F4F4"/>
       </w:pPr>
-      <w:r>
-        <w:rPr>
-          <w:rFonts w:ascii="Consolas" w:hAnsi="Consolas"/>
-          <w:sz w:val="18"/>
-          <w:szCs w:val="18"/>
-        </w:rPr>
-        <w:t xml:space="preserve">openssl rand -base64 48                               # 로컬에서 강한 secret 생성 (매번 다른 값)</w:t>
+      <w:bookmarkStart w:id="0" w:name="_GoBack"/>
+      <w:r>
+        <w:rPr>
+          <w:rFonts w:ascii="Consolas" w:hAnsi="Consolas"/>
+          <w:sz w:val="18"/>
+          <w:szCs w:val="18"/>
+        </w:rPr>
+        <w:t>openssl rand -base64 48</w:t>
+      </w:r>
+      <w:bookmarkEnd w:id="0"/>
+      <w:r>
+        <w:rPr>
+          <w:rFonts w:ascii="Consolas" w:hAnsi="Consolas"/>
+          <w:sz w:val="18"/>
+          <w:szCs w:val="18"/>
+        </w:rPr>
+        <w:t xml:space="preserve">                               # 로컬에서 강한 secret 생성 (매번 다른 값)</w:t>
       </w:r>
     </w:p>
     <w:p>
@@ -3658,7 +3956,7 @@
           <w:bCs/>
           <w:color w:val="2E5496"/>
         </w:rPr>
-        <w:t xml:space="preserve">Q7. jwt.allow-insecure-secret 의 기본값만 false 로 바꿨더니 기동이 안 됩니다. 왜 그런가요?</w:t>
+        <w:t>Q7. jwt.allow-insecure-secret 의 기본값만 false 로 바꿨더니 기동이 안 됩니다. 왜 그런가요?</w:t>
       </w:r>
     </w:p>
     <w:p>
@@ -3666,7 +3964,9 @@
         <w:spacing w:after="80" w:line="272" w:lineRule="auto"/>
       </w:pPr>
       <w:r>
-        <w:t xml:space="preserve">버그가 아니라 fail-closed 가 의도대로 작동한 것이다. application.properties 의 jwt.secret 은 그대로 커밋된 공개 기본값(KNOWN_WEAK_SECRETS 에 등록된 값)을 쓰는데, jwt.allow-insecure-secret 기본값만 false 로 바꾸면 "약한 secret(기본값 그대로) + allow-insecure-secret=false" 조합이 되어, Q3 에서 설명한 "의도된 안전 동작"이 그대로 발동한다. allow-insecure-secret 과 jwt.secret 은 쌍으로 바뀔어야 하며, 하나만 바꾸면 항상 실패한다.</w:t>
+        <w:t xml:space="preserve">버그가 아니라 fail-closed 가 의도대로 작동한 것이다. application.properties 의 jwt.secret 은 그대로 커밋된 공개 기본값(KNOWN_WEAK_SECRETS 에 등록된 값)을 쓰는데, jwt.allow-insecure-secret 기본값만 false 로 바꾸면 "약한 secret(기본값 그대로) + allow-insecure-secret=false" 조합이 되어, Q3 에서 설명한 </w:t>
+        <w:lastRenderedPageBreak/>
+        <w:t>"의도된 안전 동작"이 그대로 발동한다. allow-insecure-secret 과 jwt.secret 은 쌍으로 바뀔어야 하며, 하나만 바꾸면 항상 실패한다.</w:t>
       </w:r>
     </w:p>
     <w:p>
@@ -3699,7 +3999,7 @@
           <w:sz w:val="18"/>
           <w:szCs w:val="18"/>
         </w:rPr>
-        <w:t xml:space="preserve">if (!weak) return;</w:t>
+        <w:t>if (!weak) return;</w:t>
       </w:r>
     </w:p>
     <w:p>
@@ -3760,7 +4060,7 @@
                 <w:sz w:val="18"/>
                 <w:szCs w:val="18"/>
               </w:rPr>
-              <w:t xml:space="preserve">목적</w:t>
+              <w:t>목적</w:t>
             </w:r>
           </w:p>
         </w:tc>
@@ -3784,7 +4084,7 @@
                 <w:sz w:val="18"/>
                 <w:szCs w:val="18"/>
               </w:rPr>
-              <w:t xml:space="preserve">해야 할 일</w:t>
+              <w:t>해야 할 일</w:t>
             </w:r>
           </w:p>
         </w:tc>
@@ -3806,7 +4106,7 @@
                 <w:sz w:val="18"/>
                 <w:szCs w:val="18"/>
               </w:rPr>
-              <w:t xml:space="preserve">1단계 공격 실습 계속하기(이 브랜치의 기본 목적)</w:t>
+              <w:t>1단계 공격 실습 계속하기(이 브랜치의 기본 목적)</w:t>
             </w:r>
           </w:p>
         </w:tc>
@@ -3849,7 +4149,7 @@
                 <w:sz w:val="18"/>
                 <w:szCs w:val="18"/>
               </w:rPr>
-              <w:t xml:space="preserve">"강한 secret 이면 위조가 막힌다" 시연</w:t>
+              <w:t>"강한 secret 이면 위조가 막힌다" 시연</w:t>
             </w:r>
           </w:p>
         </w:tc>
@@ -3885,7 +4185,7 @@
           <w:i/>
           <w:iCs/>
         </w:rPr>
-        <w:t xml:space="preserve">즉 jwt.allow-insecure-secret 은 "secret 이 약할 때만" 의미가 있는 보조 안전장치다. secret 을 강하게 주입하면 이 플래그를 true/false 어느 쪽에 둡 결과는 같다(둘 다 통과).</w:t>
+        <w:t>즉 jwt.allow-insecure-secret 은 "secret 이 약할 때만" 의미가 있는 보조 안전장치다. secret 을 강하게 주입하면 이 플래그를 true/false 어느 쪽에 둡 결과는 같다(둘 다 통과).</w:t>
       </w:r>
     </w:p>
     <w:sectPr>

</xml_diff>